<commit_message>
style(docs): eliminate harsh dark boxes, apply minimalist hairline borders and clean academic styling
</commit_message>
<xml_diff>
--- a/.aKetqua/BÀI TẬP CÁ NHÂN WINDOW LINUX.docx
+++ b/.aKetqua/BÀI TẬP CÁ NHÂN WINDOW LINUX.docx
@@ -5320,20 +5320,20 @@
         <w:jc w:val="center"/>
         <w:tblLayout w:type="fixed"/>
         <w:tblLook w:val="0400" w:firstRow="0" w:lastRow="0" w:firstColumn="0" w:lastColumn="0" w:noHBand="0" w:noVBand="1"/>
-        <w:tblBorders>
-          <w:top w:val="single" w:sz="8" w:space="0" w:color="1E293B"/>
-          <w:bottom w:val="single" w:sz="8" w:space="0" w:color="1E293B"/>
-          <w:left w:val="none"/>
-          <w:right w:val="none"/>
-          <w:insideH w:val="single" w:sz="4" w:space="0" w:color="CBD5E1"/>
-          <w:insideV w:val="single" w:sz="4" w:space="0" w:color="E2E8F0"/>
-        </w:tblBorders>
         <w:tblCellMar>
           <w:top w:w="120" w:type="dxa"/>
           <w:bottom w:w="120" w:type="dxa"/>
           <w:left w:w="160" w:type="dxa"/>
           <w:right w:w="160" w:type="dxa"/>
         </w:tblCellMar>
+        <w:tblBorders>
+          <w:top w:val="none" w:sz="0" w:space="0" w:color="auto"/>
+          <w:left w:val="single" w:sz="24" w:space="0" w:color="003366"/>
+          <w:bottom w:val="none" w:sz="0" w:space="0" w:color="auto"/>
+          <w:right w:val="none" w:sz="0" w:space="0" w:color="auto"/>
+          <w:insideH w:val="none" w:sz="0" w:space="0" w:color="auto"/>
+          <w:insideV w:val="none" w:sz="0" w:space="0" w:color="auto"/>
+        </w:tblBorders>
       </w:tblPr>
       <w:tblGrid>
         <w:gridCol w:w="9403"/>
@@ -5347,8 +5347,20 @@
         <w:tc>
           <w:tcPr>
             <w:tcW w:w="9403" w:type="dxa"/>
-            <w:shd w:fill="1E293B"/>
-            <w:vAlign w:val="center"/>
+            <w:vAlign w:val="center"/>
+            <w:shd w:fill="F8FAFC" w:val="clear"/>
+            <w:tcBorders>
+              <w:top w:val="none" w:sz="0" w:space="0" w:color="auto"/>
+              <w:left w:val="single" w:sz="24" w:space="0" w:color="003366"/>
+              <w:bottom w:val="none" w:sz="0" w:space="0" w:color="auto"/>
+              <w:right w:val="none" w:sz="0" w:space="0" w:color="auto"/>
+            </w:tcBorders>
+            <w:tcMar>
+              <w:top w:w="120" w:type="dxa"/>
+              <w:left w:w="180" w:type="dxa"/>
+              <w:bottom w:w="120" w:type="dxa"/>
+              <w:right w:w="180" w:type="dxa"/>
+            </w:tcMar>
           </w:tcPr>
           <w:p>
             <w:pPr>
@@ -5367,8 +5379,9 @@
                 <w:b/>
                 <w:bCs/>
                 <w:i w:val="0"/>
-                <w:color w:val="FFFFFF"/>
-                <w:sz w:val="21"/>
+                <w:sz w:val="22"/>
+                <w:szCs w:val="22"/>
+                <w:color w:val="0F172A"/>
               </w:rPr>
               <w:t>📌 LỜI CẢNH BÁO MANG TÍNH BƯỚC NGOẶT CỦA GIẢNG VIÊN HƯỚNG DẪN:</w:t>
             </w:r>
@@ -5378,8 +5391,9 @@
                 <w:b/>
                 <w:bCs/>
                 <w:i w:val="0"/>
-                <w:color w:val="FFFFFF"/>
-                <w:sz w:val="21"/>
+                <w:sz w:val="22"/>
+                <w:szCs w:val="22"/>
+                <w:color w:val="0F172A"/>
               </w:rPr>
               <w:br/>
             </w:r>
@@ -5389,8 +5403,9 @@
                 <w:b/>
                 <w:i w:val="0"/>
                 <w:iCs/>
-                <w:color w:val="FFFFFF"/>
-                <w:sz w:val="21"/>
+                <w:sz w:val="22"/>
+                <w:szCs w:val="22"/>
+                <w:color w:val="0F172A"/>
               </w:rPr>
               <w:t>Lời nhận xét của Giảng viên: 'Nếu chỉ đơn thuần là cài đặt Cowrie Honeypot theo hướng dẫn có sẵn trên mạng, sau đó viết một vài dòng script đọc file cowrie.json và bắn tin nhắn thông báo vào Telegram Bot khi có ai đăng nhập, thì đây chỉ là mức độ Cài đặt và Ứng dụng công cụ có sẵn (Script-kiddie / Application Configuration Level), hoàn toàn thiếu hàm lượng nghiên cứu khoa học, không có đóng góp về mặt kỹ thuật kỹ sư và chắc chắn không thể đạt điểm giỏi/xuất sắc.'</w:t>
             </w:r>
@@ -14585,20 +14600,20 @@
         <w:jc w:val="center"/>
         <w:tblLayout w:type="fixed"/>
         <w:tblLook w:val="0400" w:firstRow="0" w:lastRow="0" w:firstColumn="0" w:lastColumn="0" w:noHBand="0" w:noVBand="1"/>
-        <w:tblBorders>
-          <w:top w:val="single" w:sz="8" w:space="0" w:color="1E293B"/>
-          <w:bottom w:val="single" w:sz="8" w:space="0" w:color="1E293B"/>
-          <w:left w:val="none"/>
-          <w:right w:val="none"/>
-          <w:insideH w:val="single" w:sz="4" w:space="0" w:color="CBD5E1"/>
-          <w:insideV w:val="single" w:sz="4" w:space="0" w:color="E2E8F0"/>
-        </w:tblBorders>
         <w:tblCellMar>
           <w:top w:w="120" w:type="dxa"/>
           <w:bottom w:w="120" w:type="dxa"/>
           <w:left w:w="160" w:type="dxa"/>
           <w:right w:w="160" w:type="dxa"/>
         </w:tblCellMar>
+        <w:tblBorders>
+          <w:top w:val="none" w:sz="0" w:space="0" w:color="auto"/>
+          <w:left w:val="single" w:sz="24" w:space="0" w:color="003366"/>
+          <w:bottom w:val="none" w:sz="0" w:space="0" w:color="auto"/>
+          <w:right w:val="none" w:sz="0" w:space="0" w:color="auto"/>
+          <w:insideH w:val="none" w:sz="0" w:space="0" w:color="auto"/>
+          <w:insideV w:val="none" w:sz="0" w:space="0" w:color="auto"/>
+        </w:tblBorders>
       </w:tblPr>
       <w:tblGrid>
         <w:gridCol w:w="9403"/>
@@ -14612,8 +14627,20 @@
         <w:tc>
           <w:tcPr>
             <w:tcW w:w="9403" w:type="dxa"/>
-            <w:shd w:fill="1E293B"/>
-            <w:vAlign w:val="center"/>
+            <w:vAlign w:val="center"/>
+            <w:shd w:fill="F8FAFC" w:val="clear"/>
+            <w:tcBorders>
+              <w:top w:val="none" w:sz="0" w:space="0" w:color="auto"/>
+              <w:left w:val="single" w:sz="24" w:space="0" w:color="003366"/>
+              <w:bottom w:val="none" w:sz="0" w:space="0" w:color="auto"/>
+              <w:right w:val="none" w:sz="0" w:space="0" w:color="auto"/>
+            </w:tcBorders>
+            <w:tcMar>
+              <w:top w:w="120" w:type="dxa"/>
+              <w:left w:w="180" w:type="dxa"/>
+              <w:bottom w:w="120" w:type="dxa"/>
+              <w:right w:w="180" w:type="dxa"/>
+            </w:tcMar>
           </w:tcPr>
           <w:p>
             <w:pPr>
@@ -14632,8 +14659,9 @@
                 <w:b/>
                 <w:bCs/>
                 <w:i w:val="0"/>
-                <w:color w:val="FFFFFF"/>
-                <w:sz w:val="21"/>
+                <w:sz w:val="22"/>
+                <w:szCs w:val="22"/>
+                <w:color w:val="0F172A"/>
               </w:rPr>
               <w:t>📌 GHI CHÚ HỌC THUẬT: ĐỘT PHÁ CỦA MÔ HÌNH HONEYNET PHÂN TÁN TRONG TÁC CHIẾN ACTIVE DEFENSE &amp; SOAR:</w:t>
             </w:r>
@@ -14643,8 +14671,9 @@
                 <w:b/>
                 <w:bCs/>
                 <w:i w:val="0"/>
-                <w:color w:val="FFFFFF"/>
-                <w:sz w:val="21"/>
+                <w:sz w:val="22"/>
+                <w:szCs w:val="22"/>
+                <w:color w:val="0F172A"/>
               </w:rPr>
               <w:br/>
             </w:r>
@@ -14654,8 +14683,9 @@
                 <w:b/>
                 <w:i w:val="0"/>
                 <w:iCs/>
-                <w:color w:val="FFFFFF"/>
-                <w:sz w:val="21"/>
+                <w:sz w:val="22"/>
+                <w:szCs w:val="22"/>
+                <w:color w:val="0F172A"/>
               </w:rPr>
               <w:t>Kiến trúc Honeynet Phân tán cho phép hệ thống mở rộng từ mô hình bẫy mồi phòng thí nghiệm đơn lẻ thành mạng lưới cảm biến đan xen (Sensor Mesh) cấp doanh nghiệp. Điểm đột phá kỹ thuật nằm ở cơ chế tương quan Cross-Subnet: Kẻ tấn công cho dù sử dụng kỹ thuật trinh sát phân tán chậm (Slow-and-Low Scan) để lẩn tránh IDS/IPS truyền thống vẫn sẽ bị vạch trần ngay khi chạm vào 2 bẫy mồi ở các phân vùng mạng khác nhau.</w:t>
             </w:r>
@@ -14779,20 +14809,20 @@
         <w:jc w:val="center"/>
         <w:tblLayout w:type="fixed"/>
         <w:tblLook w:val="0400" w:firstRow="0" w:lastRow="0" w:firstColumn="0" w:lastColumn="0" w:noHBand="0" w:noVBand="1"/>
-        <w:tblBorders>
-          <w:top w:val="single" w:sz="8" w:space="0" w:color="1E293B"/>
-          <w:bottom w:val="single" w:sz="8" w:space="0" w:color="1E293B"/>
-          <w:left w:val="none"/>
-          <w:right w:val="none"/>
-          <w:insideH w:val="single" w:sz="4" w:space="0" w:color="CBD5E1"/>
-          <w:insideV w:val="single" w:sz="4" w:space="0" w:color="E2E8F0"/>
-        </w:tblBorders>
         <w:tblCellMar>
           <w:top w:w="120" w:type="dxa"/>
           <w:bottom w:w="120" w:type="dxa"/>
           <w:left w:w="160" w:type="dxa"/>
           <w:right w:w="160" w:type="dxa"/>
         </w:tblCellMar>
+        <w:tblBorders>
+          <w:top w:val="single" w:sz="4" w:space="0" w:color="CBD5E1"/>
+          <w:left w:val="single" w:sz="4" w:space="0" w:color="CBD5E1"/>
+          <w:bottom w:val="single" w:sz="4" w:space="0" w:color="CBD5E1"/>
+          <w:right w:val="single" w:sz="4" w:space="0" w:color="CBD5E1"/>
+          <w:insideH w:val="none" w:sz="0" w:space="0" w:color="auto"/>
+          <w:insideV w:val="none" w:sz="0" w:space="0" w:color="auto"/>
+        </w:tblBorders>
       </w:tblPr>
       <w:tblGrid>
         <w:gridCol w:w="9403"/>
@@ -14806,8 +14836,20 @@
         <w:tc>
           <w:tcPr>
             <w:tcW w:w="9403" w:type="dxa"/>
-            <w:shd w:fill="1E293B"/>
-            <w:vAlign w:val="center"/>
+            <w:vAlign w:val="center"/>
+            <w:shd w:fill="F8FAFC" w:val="clear"/>
+            <w:tcBorders>
+              <w:top w:val="single" w:sz="4" w:space="0" w:color="CBD5E1"/>
+              <w:left w:val="single" w:sz="4" w:space="0" w:color="CBD5E1"/>
+              <w:bottom w:val="single" w:sz="4" w:space="0" w:color="CBD5E1"/>
+              <w:right w:val="single" w:sz="4" w:space="0" w:color="CBD5E1"/>
+            </w:tcBorders>
+            <w:tcMar>
+              <w:top w:w="100" w:type="dxa"/>
+              <w:left w:w="160" w:type="dxa"/>
+              <w:bottom w:w="100" w:type="dxa"/>
+              <w:right w:w="160" w:type="dxa"/>
+            </w:tcMar>
           </w:tcPr>
           <w:p>
             <w:pPr>
@@ -14822,12 +14864,12 @@
             </w:pPr>
             <w:r>
               <w:rPr>
-                <w:rFonts w:ascii="Times New Roman" w:eastAsia="Consolas" w:hAnsi="Times New Roman" w:cs="Times New Roman"/>
+                <w:rFonts w:ascii="Consolas" w:eastAsia="Consolas" w:hAnsi="Consolas" w:cs="Consolas"/>
                 <w:b/>
                 <w:i w:val="0"/>
-                <w:color w:val="FFFFFF"/>
-                <w:sz w:val="21"/>
+                <w:sz w:val="19"/>
                 <w:szCs w:val="19"/>
+                <w:color w:val="0F172A"/>
               </w:rPr>
               <w:t>iptables -t nat -A PREROUTING -p tcp --dport 22 -j REDIRECT --to-port 2222</w:t>
             </w:r>
@@ -14889,20 +14931,20 @@
         <w:jc w:val="center"/>
         <w:tblLayout w:type="fixed"/>
         <w:tblLook w:val="0400" w:firstRow="0" w:lastRow="0" w:firstColumn="0" w:lastColumn="0" w:noHBand="0" w:noVBand="1"/>
-        <w:tblBorders>
-          <w:top w:val="single" w:sz="8" w:space="0" w:color="1E293B"/>
-          <w:bottom w:val="single" w:sz="8" w:space="0" w:color="1E293B"/>
-          <w:left w:val="none"/>
-          <w:right w:val="none"/>
-          <w:insideH w:val="single" w:sz="4" w:space="0" w:color="CBD5E1"/>
-          <w:insideV w:val="single" w:sz="4" w:space="0" w:color="E2E8F0"/>
-        </w:tblBorders>
         <w:tblCellMar>
           <w:top w:w="120" w:type="dxa"/>
           <w:bottom w:w="120" w:type="dxa"/>
           <w:left w:w="160" w:type="dxa"/>
           <w:right w:w="160" w:type="dxa"/>
         </w:tblCellMar>
+        <w:tblBorders>
+          <w:top w:val="single" w:sz="4" w:space="0" w:color="CBD5E1"/>
+          <w:left w:val="single" w:sz="4" w:space="0" w:color="CBD5E1"/>
+          <w:bottom w:val="single" w:sz="4" w:space="0" w:color="CBD5E1"/>
+          <w:right w:val="single" w:sz="4" w:space="0" w:color="CBD5E1"/>
+          <w:insideH w:val="none" w:sz="0" w:space="0" w:color="auto"/>
+          <w:insideV w:val="none" w:sz="0" w:space="0" w:color="auto"/>
+        </w:tblBorders>
       </w:tblPr>
       <w:tblGrid>
         <w:gridCol w:w="9403"/>
@@ -14916,8 +14958,20 @@
         <w:tc>
           <w:tcPr>
             <w:tcW w:w="9403" w:type="dxa"/>
-            <w:shd w:fill="1E293B"/>
-            <w:vAlign w:val="center"/>
+            <w:vAlign w:val="center"/>
+            <w:shd w:fill="F8FAFC" w:val="clear"/>
+            <w:tcBorders>
+              <w:top w:val="single" w:sz="4" w:space="0" w:color="CBD5E1"/>
+              <w:left w:val="single" w:sz="4" w:space="0" w:color="CBD5E1"/>
+              <w:bottom w:val="single" w:sz="4" w:space="0" w:color="CBD5E1"/>
+              <w:right w:val="single" w:sz="4" w:space="0" w:color="CBD5E1"/>
+            </w:tcBorders>
+            <w:tcMar>
+              <w:top w:w="100" w:type="dxa"/>
+              <w:left w:w="160" w:type="dxa"/>
+              <w:bottom w:w="100" w:type="dxa"/>
+              <w:right w:w="160" w:type="dxa"/>
+            </w:tcMar>
           </w:tcPr>
           <w:p>
             <w:pPr>
@@ -14932,118 +14986,118 @@
             </w:pPr>
             <w:r>
               <w:rPr>
-                <w:rFonts w:ascii="Times New Roman" w:eastAsia="Consolas" w:hAnsi="Times New Roman" w:cs="Times New Roman"/>
+                <w:rFonts w:ascii="Consolas" w:eastAsia="Consolas" w:hAnsi="Consolas" w:cs="Consolas"/>
                 <w:b/>
                 <w:i w:val="0"/>
-                <w:color w:val="FFFFFF"/>
-                <w:sz w:val="21"/>
+                <w:sz w:val="19"/>
                 <w:szCs w:val="19"/>
+                <w:color w:val="0F172A"/>
               </w:rPr>
               <w:t>[honeypot]</w:t>
             </w:r>
             <w:r>
               <w:rPr>
-                <w:rFonts w:ascii="Times New Roman" w:eastAsia="Consolas" w:hAnsi="Times New Roman" w:cs="Times New Roman"/>
+                <w:rFonts w:ascii="Consolas" w:eastAsia="Consolas" w:hAnsi="Consolas" w:cs="Consolas"/>
                 <w:b/>
                 <w:i w:val="0"/>
-                <w:color w:val="FFFFFF"/>
-                <w:sz w:val="21"/>
+                <w:sz w:val="19"/>
                 <w:szCs w:val="19"/>
+                <w:color w:val="0F172A"/>
               </w:rPr>
               <w:br/>
               <w:t>hostname = corp-db-master-01</w:t>
             </w:r>
             <w:r>
               <w:rPr>
-                <w:rFonts w:ascii="Times New Roman" w:eastAsia="Consolas" w:hAnsi="Times New Roman" w:cs="Times New Roman"/>
+                <w:rFonts w:ascii="Consolas" w:eastAsia="Consolas" w:hAnsi="Consolas" w:cs="Consolas"/>
                 <w:b/>
                 <w:i w:val="0"/>
-                <w:color w:val="FFFFFF"/>
-                <w:sz w:val="21"/>
+                <w:sz w:val="19"/>
                 <w:szCs w:val="19"/>
+                <w:color w:val="0F172A"/>
               </w:rPr>
               <w:br/>
               <w:t>log_path = var/log/cowrie</w:t>
             </w:r>
             <w:r>
               <w:rPr>
-                <w:rFonts w:ascii="Times New Roman" w:eastAsia="Consolas" w:hAnsi="Times New Roman" w:cs="Times New Roman"/>
+                <w:rFonts w:ascii="Consolas" w:eastAsia="Consolas" w:hAnsi="Consolas" w:cs="Consolas"/>
                 <w:b/>
                 <w:i w:val="0"/>
-                <w:color w:val="FFFFFF"/>
-                <w:sz w:val="21"/>
+                <w:sz w:val="19"/>
                 <w:szCs w:val="19"/>
+                <w:color w:val="0F172A"/>
               </w:rPr>
               <w:br/>
               <w:t>download_path = var/lib/cowrie/downloads</w:t>
             </w:r>
             <w:r>
               <w:rPr>
-                <w:rFonts w:ascii="Times New Roman" w:eastAsia="Consolas" w:hAnsi="Times New Roman" w:cs="Times New Roman"/>
+                <w:rFonts w:ascii="Consolas" w:eastAsia="Consolas" w:hAnsi="Consolas" w:cs="Consolas"/>
                 <w:b/>
                 <w:i w:val="0"/>
-                <w:color w:val="FFFFFF"/>
-                <w:sz w:val="21"/>
+                <w:sz w:val="19"/>
                 <w:szCs w:val="19"/>
+                <w:color w:val="0F172A"/>
               </w:rPr>
               <w:br/>
               <w:t>contents_path = share/cowrie/contents</w:t>
             </w:r>
             <w:r>
               <w:rPr>
-                <w:rFonts w:ascii="Times New Roman" w:eastAsia="Consolas" w:hAnsi="Times New Roman" w:cs="Times New Roman"/>
+                <w:rFonts w:ascii="Consolas" w:eastAsia="Consolas" w:hAnsi="Consolas" w:cs="Consolas"/>
                 <w:b/>
                 <w:i w:val="0"/>
-                <w:color w:val="FFFFFF"/>
-                <w:sz w:val="21"/>
+                <w:sz w:val="19"/>
                 <w:szCs w:val="19"/>
+                <w:color w:val="0F172A"/>
               </w:rPr>
               <w:br/>
               <w:t>txtcmds_path = share/cowrie/txtcmds</w:t>
             </w:r>
             <w:r>
               <w:rPr>
-                <w:rFonts w:ascii="Times New Roman" w:eastAsia="Consolas" w:hAnsi="Times New Roman" w:cs="Times New Roman"/>
+                <w:rFonts w:ascii="Consolas" w:eastAsia="Consolas" w:hAnsi="Consolas" w:cs="Consolas"/>
                 <w:b/>
                 <w:i w:val="0"/>
-                <w:color w:val="FFFFFF"/>
-                <w:sz w:val="21"/>
+                <w:sz w:val="19"/>
                 <w:szCs w:val="19"/>
+                <w:color w:val="0F172A"/>
               </w:rPr>
               <w:br/>
             </w:r>
             <w:r>
               <w:rPr>
-                <w:rFonts w:ascii="Times New Roman" w:eastAsia="Consolas" w:hAnsi="Times New Roman" w:cs="Times New Roman"/>
+                <w:rFonts w:ascii="Consolas" w:eastAsia="Consolas" w:hAnsi="Consolas" w:cs="Consolas"/>
                 <w:b/>
                 <w:i w:val="0"/>
-                <w:color w:val="FFFFFF"/>
-                <w:sz w:val="21"/>
+                <w:sz w:val="19"/>
                 <w:szCs w:val="19"/>
+                <w:color w:val="0F172A"/>
               </w:rPr>
               <w:br/>
               <w:t>[ssh]</w:t>
             </w:r>
             <w:r>
               <w:rPr>
-                <w:rFonts w:ascii="Times New Roman" w:eastAsia="Consolas" w:hAnsi="Times New Roman" w:cs="Times New Roman"/>
+                <w:rFonts w:ascii="Consolas" w:eastAsia="Consolas" w:hAnsi="Consolas" w:cs="Consolas"/>
                 <w:b/>
                 <w:i w:val="0"/>
-                <w:color w:val="FFFFFF"/>
-                <w:sz w:val="21"/>
+                <w:sz w:val="19"/>
                 <w:szCs w:val="19"/>
+                <w:color w:val="0F172A"/>
               </w:rPr>
               <w:br/>
               <w:t>enabled = true</w:t>
             </w:r>
             <w:r>
               <w:rPr>
-                <w:rFonts w:ascii="Times New Roman" w:eastAsia="Consolas" w:hAnsi="Times New Roman" w:cs="Times New Roman"/>
+                <w:rFonts w:ascii="Consolas" w:eastAsia="Consolas" w:hAnsi="Consolas" w:cs="Consolas"/>
                 <w:b/>
                 <w:i w:val="0"/>
-                <w:color w:val="FFFFFF"/>
-                <w:sz w:val="21"/>
+                <w:sz w:val="19"/>
                 <w:szCs w:val="19"/>
+                <w:color w:val="0F172A"/>
               </w:rPr>
               <w:br/>
               <w:t>listen_endpoints = tcp:</w:t>
@@ -15051,82 +15105,82 @@
             <w:proofErr w:type="gramStart"/>
             <w:r>
               <w:rPr>
-                <w:rFonts w:ascii="Times New Roman" w:eastAsia="Consolas" w:hAnsi="Times New Roman" w:cs="Times New Roman"/>
+                <w:rFonts w:ascii="Consolas" w:eastAsia="Consolas" w:hAnsi="Consolas" w:cs="Consolas"/>
                 <w:b/>
                 <w:i w:val="0"/>
-                <w:color w:val="FFFFFF"/>
-                <w:sz w:val="21"/>
+                <w:sz w:val="19"/>
                 <w:szCs w:val="19"/>
+                <w:color w:val="0F172A"/>
               </w:rPr>
               <w:t>2222:interface</w:t>
             </w:r>
             <w:proofErr w:type="gramEnd"/>
             <w:r>
               <w:rPr>
-                <w:rFonts w:ascii="Times New Roman" w:eastAsia="Consolas" w:hAnsi="Times New Roman" w:cs="Times New Roman"/>
+                <w:rFonts w:ascii="Consolas" w:eastAsia="Consolas" w:hAnsi="Consolas" w:cs="Consolas"/>
                 <w:b/>
                 <w:i w:val="0"/>
-                <w:color w:val="FFFFFF"/>
-                <w:sz w:val="21"/>
+                <w:sz w:val="19"/>
                 <w:szCs w:val="19"/>
+                <w:color w:val="0F172A"/>
               </w:rPr>
               <w:t>=0.0.0.0</w:t>
             </w:r>
             <w:r>
               <w:rPr>
-                <w:rFonts w:ascii="Times New Roman" w:eastAsia="Consolas" w:hAnsi="Times New Roman" w:cs="Times New Roman"/>
+                <w:rFonts w:ascii="Consolas" w:eastAsia="Consolas" w:hAnsi="Consolas" w:cs="Consolas"/>
                 <w:b/>
                 <w:i w:val="0"/>
-                <w:color w:val="FFFFFF"/>
-                <w:sz w:val="21"/>
+                <w:sz w:val="19"/>
                 <w:szCs w:val="19"/>
+                <w:color w:val="0F172A"/>
               </w:rPr>
               <w:br/>
               <w:t>version = SSH-2.0-OpenSSH_8.9p1 Ubuntu-3ubuntu0.4</w:t>
             </w:r>
             <w:r>
               <w:rPr>
-                <w:rFonts w:ascii="Times New Roman" w:eastAsia="Consolas" w:hAnsi="Times New Roman" w:cs="Times New Roman"/>
+                <w:rFonts w:ascii="Consolas" w:eastAsia="Consolas" w:hAnsi="Consolas" w:cs="Consolas"/>
                 <w:b/>
                 <w:i w:val="0"/>
-                <w:color w:val="FFFFFF"/>
-                <w:sz w:val="21"/>
+                <w:sz w:val="19"/>
                 <w:szCs w:val="19"/>
+                <w:color w:val="0F172A"/>
               </w:rPr>
               <w:br/>
             </w:r>
             <w:r>
               <w:rPr>
-                <w:rFonts w:ascii="Times New Roman" w:eastAsia="Consolas" w:hAnsi="Times New Roman" w:cs="Times New Roman"/>
+                <w:rFonts w:ascii="Consolas" w:eastAsia="Consolas" w:hAnsi="Consolas" w:cs="Consolas"/>
                 <w:b/>
                 <w:i w:val="0"/>
-                <w:color w:val="FFFFFF"/>
-                <w:sz w:val="21"/>
+                <w:sz w:val="19"/>
                 <w:szCs w:val="19"/>
+                <w:color w:val="0F172A"/>
               </w:rPr>
               <w:br/>
               <w:t>[output_json]</w:t>
             </w:r>
             <w:r>
               <w:rPr>
-                <w:rFonts w:ascii="Times New Roman" w:eastAsia="Consolas" w:hAnsi="Times New Roman" w:cs="Times New Roman"/>
+                <w:rFonts w:ascii="Consolas" w:eastAsia="Consolas" w:hAnsi="Consolas" w:cs="Consolas"/>
                 <w:b/>
                 <w:i w:val="0"/>
-                <w:color w:val="FFFFFF"/>
-                <w:sz w:val="21"/>
+                <w:sz w:val="19"/>
                 <w:szCs w:val="19"/>
+                <w:color w:val="0F172A"/>
               </w:rPr>
               <w:br/>
               <w:t>enabled = true</w:t>
             </w:r>
             <w:r>
               <w:rPr>
-                <w:rFonts w:ascii="Times New Roman" w:eastAsia="Consolas" w:hAnsi="Times New Roman" w:cs="Times New Roman"/>
+                <w:rFonts w:ascii="Consolas" w:eastAsia="Consolas" w:hAnsi="Consolas" w:cs="Consolas"/>
                 <w:b/>
                 <w:i w:val="0"/>
-                <w:color w:val="FFFFFF"/>
-                <w:sz w:val="21"/>
+                <w:sz w:val="19"/>
                 <w:szCs w:val="19"/>
+                <w:color w:val="0F172A"/>
               </w:rPr>
               <w:br/>
               <w:t>logfile = var/log/cowrie/cowrie.json</w:t>
@@ -15238,20 +15292,20 @@
         <w:jc w:val="center"/>
         <w:tblLayout w:type="fixed"/>
         <w:tblLook w:val="0400" w:firstRow="0" w:lastRow="0" w:firstColumn="0" w:lastColumn="0" w:noHBand="0" w:noVBand="1"/>
-        <w:tblBorders>
-          <w:top w:val="single" w:sz="8" w:space="0" w:color="1E293B"/>
-          <w:bottom w:val="single" w:sz="8" w:space="0" w:color="1E293B"/>
-          <w:left w:val="none"/>
-          <w:right w:val="none"/>
-          <w:insideH w:val="single" w:sz="4" w:space="0" w:color="CBD5E1"/>
-          <w:insideV w:val="single" w:sz="4" w:space="0" w:color="E2E8F0"/>
-        </w:tblBorders>
         <w:tblCellMar>
           <w:top w:w="120" w:type="dxa"/>
           <w:bottom w:w="120" w:type="dxa"/>
           <w:left w:w="160" w:type="dxa"/>
           <w:right w:w="160" w:type="dxa"/>
         </w:tblCellMar>
+        <w:tblBorders>
+          <w:top w:val="single" w:sz="4" w:space="0" w:color="CBD5E1"/>
+          <w:left w:val="single" w:sz="4" w:space="0" w:color="CBD5E1"/>
+          <w:bottom w:val="single" w:sz="4" w:space="0" w:color="CBD5E1"/>
+          <w:right w:val="single" w:sz="4" w:space="0" w:color="CBD5E1"/>
+          <w:insideH w:val="none" w:sz="0" w:space="0" w:color="auto"/>
+          <w:insideV w:val="none" w:sz="0" w:space="0" w:color="auto"/>
+        </w:tblBorders>
       </w:tblPr>
       <w:tblGrid>
         <w:gridCol w:w="9403"/>
@@ -15265,8 +15319,20 @@
         <w:tc>
           <w:tcPr>
             <w:tcW w:w="9403" w:type="dxa"/>
-            <w:shd w:fill="1E293B"/>
-            <w:vAlign w:val="center"/>
+            <w:vAlign w:val="center"/>
+            <w:shd w:fill="F8FAFC" w:val="clear"/>
+            <w:tcBorders>
+              <w:top w:val="single" w:sz="4" w:space="0" w:color="CBD5E1"/>
+              <w:left w:val="single" w:sz="4" w:space="0" w:color="CBD5E1"/>
+              <w:bottom w:val="single" w:sz="4" w:space="0" w:color="CBD5E1"/>
+              <w:right w:val="single" w:sz="4" w:space="0" w:color="CBD5E1"/>
+            </w:tcBorders>
+            <w:tcMar>
+              <w:top w:w="100" w:type="dxa"/>
+              <w:left w:w="160" w:type="dxa"/>
+              <w:bottom w:w="100" w:type="dxa"/>
+              <w:right w:w="160" w:type="dxa"/>
+            </w:tcMar>
           </w:tcPr>
           <w:p>
             <w:pPr>
@@ -15281,251 +15347,251 @@
             </w:pPr>
             <w:r>
               <w:rPr>
-                <w:rFonts w:ascii="Times New Roman" w:eastAsia="Consolas" w:hAnsi="Times New Roman" w:cs="Times New Roman"/>
+                <w:rFonts w:ascii="Consolas" w:eastAsia="Consolas" w:hAnsi="Consolas" w:cs="Consolas"/>
                 <w:b/>
                 <w:i w:val="0"/>
-                <w:color w:val="FFFFFF"/>
-                <w:sz w:val="21"/>
+                <w:sz w:val="19"/>
                 <w:szCs w:val="19"/>
+                <w:color w:val="0F172A"/>
               </w:rPr>
               <w:lastRenderedPageBreak/>
               <w:t>class CowrieLogListener:</w:t>
             </w:r>
             <w:r>
               <w:rPr>
-                <w:rFonts w:ascii="Times New Roman" w:eastAsia="Consolas" w:hAnsi="Times New Roman" w:cs="Times New Roman"/>
+                <w:rFonts w:ascii="Consolas" w:eastAsia="Consolas" w:hAnsi="Consolas" w:cs="Consolas"/>
                 <w:b/>
                 <w:i w:val="0"/>
-                <w:color w:val="FFFFFF"/>
-                <w:sz w:val="21"/>
+                <w:sz w:val="19"/>
                 <w:szCs w:val="19"/>
+                <w:color w:val="0F172A"/>
               </w:rPr>
               <w:br/>
               <w:t xml:space="preserve">    def __init__(self, log_file_path: str, poll_interval: float = 0.5):</w:t>
             </w:r>
             <w:r>
               <w:rPr>
-                <w:rFonts w:ascii="Times New Roman" w:eastAsia="Consolas" w:hAnsi="Times New Roman" w:cs="Times New Roman"/>
+                <w:rFonts w:ascii="Consolas" w:eastAsia="Consolas" w:hAnsi="Consolas" w:cs="Consolas"/>
                 <w:b/>
                 <w:i w:val="0"/>
-                <w:color w:val="FFFFFF"/>
-                <w:sz w:val="21"/>
+                <w:sz w:val="19"/>
                 <w:szCs w:val="19"/>
+                <w:color w:val="0F172A"/>
               </w:rPr>
               <w:br/>
               <w:t xml:space="preserve">        self.log_file_path = log_file_path</w:t>
             </w:r>
             <w:r>
               <w:rPr>
-                <w:rFonts w:ascii="Times New Roman" w:eastAsia="Consolas" w:hAnsi="Times New Roman" w:cs="Times New Roman"/>
+                <w:rFonts w:ascii="Consolas" w:eastAsia="Consolas" w:hAnsi="Consolas" w:cs="Consolas"/>
                 <w:b/>
                 <w:i w:val="0"/>
-                <w:color w:val="FFFFFF"/>
-                <w:sz w:val="21"/>
+                <w:sz w:val="19"/>
                 <w:szCs w:val="19"/>
+                <w:color w:val="0F172A"/>
               </w:rPr>
               <w:br/>
               <w:t xml:space="preserve">        self.poll_interval = poll_interval</w:t>
             </w:r>
             <w:r>
               <w:rPr>
-                <w:rFonts w:ascii="Times New Roman" w:eastAsia="Consolas" w:hAnsi="Times New Roman" w:cs="Times New Roman"/>
+                <w:rFonts w:ascii="Consolas" w:eastAsia="Consolas" w:hAnsi="Consolas" w:cs="Consolas"/>
                 <w:b/>
                 <w:i w:val="0"/>
-                <w:color w:val="FFFFFF"/>
-                <w:sz w:val="21"/>
+                <w:sz w:val="19"/>
                 <w:szCs w:val="19"/>
+                <w:color w:val="0F172A"/>
               </w:rPr>
               <w:br/>
               <w:t xml:space="preserve">        self._running = False</w:t>
             </w:r>
             <w:r>
               <w:rPr>
-                <w:rFonts w:ascii="Times New Roman" w:eastAsia="Consolas" w:hAnsi="Times New Roman" w:cs="Times New Roman"/>
+                <w:rFonts w:ascii="Consolas" w:eastAsia="Consolas" w:hAnsi="Consolas" w:cs="Consolas"/>
                 <w:b/>
                 <w:i w:val="0"/>
-                <w:color w:val="FFFFFF"/>
-                <w:sz w:val="21"/>
+                <w:sz w:val="19"/>
                 <w:szCs w:val="19"/>
+                <w:color w:val="0F172A"/>
               </w:rPr>
               <w:br/>
               <w:t xml:space="preserve">        self._last_position = 0</w:t>
             </w:r>
             <w:r>
               <w:rPr>
-                <w:rFonts w:ascii="Times New Roman" w:eastAsia="Consolas" w:hAnsi="Times New Roman" w:cs="Times New Roman"/>
+                <w:rFonts w:ascii="Consolas" w:eastAsia="Consolas" w:hAnsi="Consolas" w:cs="Consolas"/>
                 <w:b/>
                 <w:i w:val="0"/>
-                <w:color w:val="FFFFFF"/>
-                <w:sz w:val="21"/>
+                <w:sz w:val="19"/>
                 <w:szCs w:val="19"/>
+                <w:color w:val="0F172A"/>
               </w:rPr>
               <w:br/>
             </w:r>
             <w:r>
               <w:rPr>
-                <w:rFonts w:ascii="Times New Roman" w:eastAsia="Consolas" w:hAnsi="Times New Roman" w:cs="Times New Roman"/>
+                <w:rFonts w:ascii="Consolas" w:eastAsia="Consolas" w:hAnsi="Consolas" w:cs="Consolas"/>
                 <w:b/>
                 <w:i w:val="0"/>
-                <w:color w:val="FFFFFF"/>
-                <w:sz w:val="21"/>
+                <w:sz w:val="19"/>
                 <w:szCs w:val="19"/>
+                <w:color w:val="0F172A"/>
               </w:rPr>
               <w:br/>
               <w:t xml:space="preserve">    def start(self, callback: Callable[[dict], None]) -&gt; None:</w:t>
             </w:r>
             <w:r>
               <w:rPr>
-                <w:rFonts w:ascii="Times New Roman" w:eastAsia="Consolas" w:hAnsi="Times New Roman" w:cs="Times New Roman"/>
+                <w:rFonts w:ascii="Consolas" w:eastAsia="Consolas" w:hAnsi="Consolas" w:cs="Consolas"/>
                 <w:b/>
                 <w:i w:val="0"/>
-                <w:color w:val="FFFFFF"/>
-                <w:sz w:val="21"/>
+                <w:sz w:val="19"/>
                 <w:szCs w:val="19"/>
+                <w:color w:val="0F172A"/>
               </w:rPr>
               <w:br/>
               <w:t xml:space="preserve">        self._running = True</w:t>
             </w:r>
             <w:r>
               <w:rPr>
-                <w:rFonts w:ascii="Times New Roman" w:eastAsia="Consolas" w:hAnsi="Times New Roman" w:cs="Times New Roman"/>
+                <w:rFonts w:ascii="Consolas" w:eastAsia="Consolas" w:hAnsi="Consolas" w:cs="Consolas"/>
                 <w:b/>
                 <w:i w:val="0"/>
-                <w:color w:val="FFFFFF"/>
-                <w:sz w:val="21"/>
+                <w:sz w:val="19"/>
                 <w:szCs w:val="19"/>
+                <w:color w:val="0F172A"/>
               </w:rPr>
               <w:br/>
               <w:t xml:space="preserve">        with open(self.log_file_path, "r", encoding="utf-8") as f:</w:t>
             </w:r>
             <w:r>
               <w:rPr>
-                <w:rFonts w:ascii="Times New Roman" w:eastAsia="Consolas" w:hAnsi="Times New Roman" w:cs="Times New Roman"/>
+                <w:rFonts w:ascii="Consolas" w:eastAsia="Consolas" w:hAnsi="Consolas" w:cs="Consolas"/>
                 <w:b/>
                 <w:i w:val="0"/>
-                <w:color w:val="FFFFFF"/>
-                <w:sz w:val="21"/>
+                <w:sz w:val="19"/>
                 <w:szCs w:val="19"/>
+                <w:color w:val="0F172A"/>
               </w:rPr>
               <w:br/>
               <w:t xml:space="preserve">            f.seek(0, os.SEEK_END) # Nhảy tới cuối tệp để đón log mới</w:t>
             </w:r>
             <w:r>
               <w:rPr>
-                <w:rFonts w:ascii="Times New Roman" w:eastAsia="Consolas" w:hAnsi="Times New Roman" w:cs="Times New Roman"/>
+                <w:rFonts w:ascii="Consolas" w:eastAsia="Consolas" w:hAnsi="Consolas" w:cs="Consolas"/>
                 <w:b/>
                 <w:i w:val="0"/>
-                <w:color w:val="FFFFFF"/>
-                <w:sz w:val="21"/>
+                <w:sz w:val="19"/>
                 <w:szCs w:val="19"/>
+                <w:color w:val="0F172A"/>
               </w:rPr>
               <w:br/>
               <w:t xml:space="preserve">            while self._running:</w:t>
             </w:r>
             <w:r>
               <w:rPr>
-                <w:rFonts w:ascii="Times New Roman" w:eastAsia="Consolas" w:hAnsi="Times New Roman" w:cs="Times New Roman"/>
+                <w:rFonts w:ascii="Consolas" w:eastAsia="Consolas" w:hAnsi="Consolas" w:cs="Consolas"/>
                 <w:b/>
                 <w:i w:val="0"/>
-                <w:color w:val="FFFFFF"/>
-                <w:sz w:val="21"/>
+                <w:sz w:val="19"/>
                 <w:szCs w:val="19"/>
+                <w:color w:val="0F172A"/>
               </w:rPr>
               <w:br/>
               <w:t xml:space="preserve">                line = f.readline()</w:t>
             </w:r>
             <w:r>
               <w:rPr>
-                <w:rFonts w:ascii="Times New Roman" w:eastAsia="Consolas" w:hAnsi="Times New Roman" w:cs="Times New Roman"/>
+                <w:rFonts w:ascii="Consolas" w:eastAsia="Consolas" w:hAnsi="Consolas" w:cs="Consolas"/>
                 <w:b/>
                 <w:i w:val="0"/>
-                <w:color w:val="FFFFFF"/>
-                <w:sz w:val="21"/>
+                <w:sz w:val="19"/>
                 <w:szCs w:val="19"/>
+                <w:color w:val="0F172A"/>
               </w:rPr>
               <w:br/>
               <w:t xml:space="preserve">                if not line:</w:t>
             </w:r>
             <w:r>
               <w:rPr>
-                <w:rFonts w:ascii="Times New Roman" w:eastAsia="Consolas" w:hAnsi="Times New Roman" w:cs="Times New Roman"/>
+                <w:rFonts w:ascii="Consolas" w:eastAsia="Consolas" w:hAnsi="Consolas" w:cs="Consolas"/>
                 <w:b/>
                 <w:i w:val="0"/>
-                <w:color w:val="FFFFFF"/>
-                <w:sz w:val="21"/>
+                <w:sz w:val="19"/>
                 <w:szCs w:val="19"/>
+                <w:color w:val="0F172A"/>
               </w:rPr>
               <w:br/>
               <w:t xml:space="preserve">                    time.sleep(self.poll_interval)</w:t>
             </w:r>
             <w:r>
               <w:rPr>
-                <w:rFonts w:ascii="Times New Roman" w:eastAsia="Consolas" w:hAnsi="Times New Roman" w:cs="Times New Roman"/>
+                <w:rFonts w:ascii="Consolas" w:eastAsia="Consolas" w:hAnsi="Consolas" w:cs="Consolas"/>
                 <w:b/>
                 <w:i w:val="0"/>
-                <w:color w:val="FFFFFF"/>
-                <w:sz w:val="21"/>
+                <w:sz w:val="19"/>
                 <w:szCs w:val="19"/>
+                <w:color w:val="0F172A"/>
               </w:rPr>
               <w:br/>
               <w:t xml:space="preserve">                    continue</w:t>
             </w:r>
             <w:r>
               <w:rPr>
-                <w:rFonts w:ascii="Times New Roman" w:eastAsia="Consolas" w:hAnsi="Times New Roman" w:cs="Times New Roman"/>
+                <w:rFonts w:ascii="Consolas" w:eastAsia="Consolas" w:hAnsi="Consolas" w:cs="Consolas"/>
                 <w:b/>
                 <w:i w:val="0"/>
-                <w:color w:val="FFFFFF"/>
-                <w:sz w:val="21"/>
+                <w:sz w:val="19"/>
                 <w:szCs w:val="19"/>
+                <w:color w:val="0F172A"/>
               </w:rPr>
               <w:br/>
               <w:t xml:space="preserve">                try:</w:t>
             </w:r>
             <w:r>
               <w:rPr>
-                <w:rFonts w:ascii="Times New Roman" w:eastAsia="Consolas" w:hAnsi="Times New Roman" w:cs="Times New Roman"/>
+                <w:rFonts w:ascii="Consolas" w:eastAsia="Consolas" w:hAnsi="Consolas" w:cs="Consolas"/>
                 <w:b/>
                 <w:i w:val="0"/>
-                <w:color w:val="FFFFFF"/>
-                <w:sz w:val="21"/>
+                <w:sz w:val="19"/>
                 <w:szCs w:val="19"/>
+                <w:color w:val="0F172A"/>
               </w:rPr>
               <w:br/>
               <w:t xml:space="preserve">                    event = json.loads(line.strip())</w:t>
             </w:r>
             <w:r>
               <w:rPr>
-                <w:rFonts w:ascii="Times New Roman" w:eastAsia="Consolas" w:hAnsi="Times New Roman" w:cs="Times New Roman"/>
+                <w:rFonts w:ascii="Consolas" w:eastAsia="Consolas" w:hAnsi="Consolas" w:cs="Consolas"/>
                 <w:b/>
                 <w:i w:val="0"/>
-                <w:color w:val="FFFFFF"/>
-                <w:sz w:val="21"/>
+                <w:sz w:val="19"/>
                 <w:szCs w:val="19"/>
+                <w:color w:val="0F172A"/>
               </w:rPr>
               <w:br/>
               <w:t xml:space="preserve">                    callback(event)</w:t>
             </w:r>
             <w:r>
               <w:rPr>
-                <w:rFonts w:ascii="Times New Roman" w:eastAsia="Consolas" w:hAnsi="Times New Roman" w:cs="Times New Roman"/>
+                <w:rFonts w:ascii="Consolas" w:eastAsia="Consolas" w:hAnsi="Consolas" w:cs="Consolas"/>
                 <w:b/>
                 <w:i w:val="0"/>
-                <w:color w:val="FFFFFF"/>
-                <w:sz w:val="21"/>
+                <w:sz w:val="19"/>
                 <w:szCs w:val="19"/>
+                <w:color w:val="0F172A"/>
               </w:rPr>
               <w:br/>
               <w:t xml:space="preserve">                except json.JSONDecodeError:</w:t>
             </w:r>
             <w:r>
               <w:rPr>
-                <w:rFonts w:ascii="Times New Roman" w:eastAsia="Consolas" w:hAnsi="Times New Roman" w:cs="Times New Roman"/>
+                <w:rFonts w:ascii="Consolas" w:eastAsia="Consolas" w:hAnsi="Consolas" w:cs="Consolas"/>
                 <w:b/>
                 <w:i w:val="0"/>
-                <w:color w:val="FFFFFF"/>
-                <w:sz w:val="21"/>
+                <w:sz w:val="19"/>
                 <w:szCs w:val="19"/>
+                <w:color w:val="0F172A"/>
               </w:rPr>
               <w:br/>
               <w:t xml:space="preserve">                    continue</w:t>
@@ -15613,20 +15679,20 @@
         <w:jc w:val="center"/>
         <w:tblLayout w:type="fixed"/>
         <w:tblLook w:val="0400" w:firstRow="0" w:lastRow="0" w:firstColumn="0" w:lastColumn="0" w:noHBand="0" w:noVBand="1"/>
-        <w:tblBorders>
-          <w:top w:val="single" w:sz="8" w:space="0" w:color="1E293B"/>
-          <w:bottom w:val="single" w:sz="8" w:space="0" w:color="1E293B"/>
-          <w:left w:val="none"/>
-          <w:right w:val="none"/>
-          <w:insideH w:val="single" w:sz="4" w:space="0" w:color="CBD5E1"/>
-          <w:insideV w:val="single" w:sz="4" w:space="0" w:color="E2E8F0"/>
-        </w:tblBorders>
         <w:tblCellMar>
           <w:top w:w="120" w:type="dxa"/>
           <w:bottom w:w="120" w:type="dxa"/>
           <w:left w:w="160" w:type="dxa"/>
           <w:right w:w="160" w:type="dxa"/>
         </w:tblCellMar>
+        <w:tblBorders>
+          <w:top w:val="single" w:sz="4" w:space="0" w:color="CBD5E1"/>
+          <w:left w:val="single" w:sz="4" w:space="0" w:color="CBD5E1"/>
+          <w:bottom w:val="single" w:sz="4" w:space="0" w:color="CBD5E1"/>
+          <w:right w:val="single" w:sz="4" w:space="0" w:color="CBD5E1"/>
+          <w:insideH w:val="none" w:sz="0" w:space="0" w:color="auto"/>
+          <w:insideV w:val="none" w:sz="0" w:space="0" w:color="auto"/>
+        </w:tblBorders>
       </w:tblPr>
       <w:tblGrid>
         <w:gridCol w:w="9403"/>
@@ -15640,8 +15706,20 @@
         <w:tc>
           <w:tcPr>
             <w:tcW w:w="9403" w:type="dxa"/>
-            <w:shd w:fill="1E293B"/>
-            <w:vAlign w:val="center"/>
+            <w:vAlign w:val="center"/>
+            <w:shd w:fill="F8FAFC" w:val="clear"/>
+            <w:tcBorders>
+              <w:top w:val="single" w:sz="4" w:space="0" w:color="CBD5E1"/>
+              <w:left w:val="single" w:sz="4" w:space="0" w:color="CBD5E1"/>
+              <w:bottom w:val="single" w:sz="4" w:space="0" w:color="CBD5E1"/>
+              <w:right w:val="single" w:sz="4" w:space="0" w:color="CBD5E1"/>
+            </w:tcBorders>
+            <w:tcMar>
+              <w:top w:w="100" w:type="dxa"/>
+              <w:left w:w="160" w:type="dxa"/>
+              <w:bottom w:w="100" w:type="dxa"/>
+              <w:right w:w="160" w:type="dxa"/>
+            </w:tcMar>
           </w:tcPr>
           <w:p>
             <w:pPr>
@@ -15656,250 +15734,250 @@
             </w:pPr>
             <w:r>
               <w:rPr>
-                <w:rFonts w:ascii="Times New Roman" w:eastAsia="Consolas" w:hAnsi="Times New Roman" w:cs="Times New Roman"/>
+                <w:rFonts w:ascii="Consolas" w:eastAsia="Consolas" w:hAnsi="Consolas" w:cs="Consolas"/>
                 <w:b/>
                 <w:i w:val="0"/>
-                <w:color w:val="FFFFFF"/>
-                <w:sz w:val="21"/>
+                <w:sz w:val="19"/>
                 <w:szCs w:val="19"/>
+                <w:color w:val="0F172A"/>
               </w:rPr>
               <w:t># Xử lý phát hiện Brute Force T1110.001</w:t>
             </w:r>
             <w:r>
               <w:rPr>
-                <w:rFonts w:ascii="Times New Roman" w:eastAsia="Consolas" w:hAnsi="Times New Roman" w:cs="Times New Roman"/>
+                <w:rFonts w:ascii="Consolas" w:eastAsia="Consolas" w:hAnsi="Consolas" w:cs="Consolas"/>
                 <w:b/>
                 <w:i w:val="0"/>
-                <w:color w:val="FFFFFF"/>
-                <w:sz w:val="21"/>
+                <w:sz w:val="19"/>
                 <w:szCs w:val="19"/>
+                <w:color w:val="0F172A"/>
               </w:rPr>
               <w:br/>
               <w:t>if eventid == "cowrie.login.failed":</w:t>
             </w:r>
             <w:r>
               <w:rPr>
-                <w:rFonts w:ascii="Times New Roman" w:eastAsia="Consolas" w:hAnsi="Times New Roman" w:cs="Times New Roman"/>
+                <w:rFonts w:ascii="Consolas" w:eastAsia="Consolas" w:hAnsi="Consolas" w:cs="Consolas"/>
                 <w:b/>
                 <w:i w:val="0"/>
-                <w:color w:val="FFFFFF"/>
-                <w:sz w:val="21"/>
+                <w:sz w:val="19"/>
                 <w:szCs w:val="19"/>
+                <w:color w:val="0F172A"/>
               </w:rPr>
               <w:br/>
               <w:t xml:space="preserve">    self.failed_logins[src_ip] = [</w:t>
             </w:r>
             <w:r>
               <w:rPr>
-                <w:rFonts w:ascii="Times New Roman" w:eastAsia="Consolas" w:hAnsi="Times New Roman" w:cs="Times New Roman"/>
+                <w:rFonts w:ascii="Consolas" w:eastAsia="Consolas" w:hAnsi="Consolas" w:cs="Consolas"/>
                 <w:b/>
                 <w:i w:val="0"/>
-                <w:color w:val="FFFFFF"/>
-                <w:sz w:val="21"/>
+                <w:sz w:val="19"/>
                 <w:szCs w:val="19"/>
+                <w:color w:val="0F172A"/>
               </w:rPr>
               <w:br/>
               <w:t xml:space="preserve">        t for t in self.failed_logins[src_ip] if now - t &lt;= self.window_seconds</w:t>
             </w:r>
             <w:r>
               <w:rPr>
-                <w:rFonts w:ascii="Times New Roman" w:eastAsia="Consolas" w:hAnsi="Times New Roman" w:cs="Times New Roman"/>
+                <w:rFonts w:ascii="Consolas" w:eastAsia="Consolas" w:hAnsi="Consolas" w:cs="Consolas"/>
                 <w:b/>
                 <w:i w:val="0"/>
-                <w:color w:val="FFFFFF"/>
-                <w:sz w:val="21"/>
+                <w:sz w:val="19"/>
                 <w:szCs w:val="19"/>
+                <w:color w:val="0F172A"/>
               </w:rPr>
               <w:br/>
               <w:t xml:space="preserve">    ]</w:t>
             </w:r>
             <w:r>
               <w:rPr>
-                <w:rFonts w:ascii="Times New Roman" w:eastAsia="Consolas" w:hAnsi="Times New Roman" w:cs="Times New Roman"/>
+                <w:rFonts w:ascii="Consolas" w:eastAsia="Consolas" w:hAnsi="Consolas" w:cs="Consolas"/>
                 <w:b/>
                 <w:i w:val="0"/>
-                <w:color w:val="FFFFFF"/>
-                <w:sz w:val="21"/>
+                <w:sz w:val="19"/>
                 <w:szCs w:val="19"/>
+                <w:color w:val="0F172A"/>
               </w:rPr>
               <w:br/>
               <w:t xml:space="preserve">    self.failed_logins[src_ip].append(now)</w:t>
             </w:r>
             <w:r>
               <w:rPr>
-                <w:rFonts w:ascii="Times New Roman" w:eastAsia="Consolas" w:hAnsi="Times New Roman" w:cs="Times New Roman"/>
+                <w:rFonts w:ascii="Consolas" w:eastAsia="Consolas" w:hAnsi="Consolas" w:cs="Consolas"/>
                 <w:b/>
                 <w:i w:val="0"/>
-                <w:color w:val="FFFFFF"/>
-                <w:sz w:val="21"/>
+                <w:sz w:val="19"/>
                 <w:szCs w:val="19"/>
+                <w:color w:val="0F172A"/>
               </w:rPr>
               <w:br/>
             </w:r>
             <w:r>
               <w:rPr>
-                <w:rFonts w:ascii="Times New Roman" w:eastAsia="Consolas" w:hAnsi="Times New Roman" w:cs="Times New Roman"/>
+                <w:rFonts w:ascii="Consolas" w:eastAsia="Consolas" w:hAnsi="Consolas" w:cs="Consolas"/>
                 <w:b/>
                 <w:i w:val="0"/>
-                <w:color w:val="FFFFFF"/>
-                <w:sz w:val="21"/>
+                <w:sz w:val="19"/>
                 <w:szCs w:val="19"/>
+                <w:color w:val="0F172A"/>
               </w:rPr>
               <w:br/>
               <w:t xml:space="preserve">    if len(self.failed_logins[src_ip]) &gt;= self.brute_force_threshold:</w:t>
             </w:r>
             <w:r>
               <w:rPr>
-                <w:rFonts w:ascii="Times New Roman" w:eastAsia="Consolas" w:hAnsi="Times New Roman" w:cs="Times New Roman"/>
+                <w:rFonts w:ascii="Consolas" w:eastAsia="Consolas" w:hAnsi="Consolas" w:cs="Consolas"/>
                 <w:b/>
                 <w:i w:val="0"/>
-                <w:color w:val="FFFFFF"/>
-                <w:sz w:val="21"/>
+                <w:sz w:val="19"/>
                 <w:szCs w:val="19"/>
+                <w:color w:val="0F172A"/>
               </w:rPr>
               <w:br/>
               <w:t xml:space="preserve">        count = len(self.failed_logins[src_ip])</w:t>
             </w:r>
             <w:r>
               <w:rPr>
-                <w:rFonts w:ascii="Times New Roman" w:eastAsia="Consolas" w:hAnsi="Times New Roman" w:cs="Times New Roman"/>
+                <w:rFonts w:ascii="Consolas" w:eastAsia="Consolas" w:hAnsi="Consolas" w:cs="Consolas"/>
                 <w:b/>
                 <w:i w:val="0"/>
-                <w:color w:val="FFFFFF"/>
-                <w:sz w:val="21"/>
+                <w:sz w:val="19"/>
                 <w:szCs w:val="19"/>
+                <w:color w:val="0F172A"/>
               </w:rPr>
               <w:br/>
               <w:t xml:space="preserve">        self.failed_logins[src_ip].clear()</w:t>
             </w:r>
             <w:r>
               <w:rPr>
-                <w:rFonts w:ascii="Times New Roman" w:eastAsia="Consolas" w:hAnsi="Times New Roman" w:cs="Times New Roman"/>
+                <w:rFonts w:ascii="Consolas" w:eastAsia="Consolas" w:hAnsi="Consolas" w:cs="Consolas"/>
                 <w:b/>
                 <w:i w:val="0"/>
-                <w:color w:val="FFFFFF"/>
-                <w:sz w:val="21"/>
+                <w:sz w:val="19"/>
                 <w:szCs w:val="19"/>
+                <w:color w:val="0F172A"/>
               </w:rPr>
               <w:br/>
               <w:t xml:space="preserve">        return ThreatAlert(</w:t>
             </w:r>
             <w:r>
               <w:rPr>
-                <w:rFonts w:ascii="Times New Roman" w:eastAsia="Consolas" w:hAnsi="Times New Roman" w:cs="Times New Roman"/>
+                <w:rFonts w:ascii="Consolas" w:eastAsia="Consolas" w:hAnsi="Consolas" w:cs="Consolas"/>
                 <w:b/>
                 <w:i w:val="0"/>
-                <w:color w:val="FFFFFF"/>
-                <w:sz w:val="21"/>
+                <w:sz w:val="19"/>
                 <w:szCs w:val="19"/>
+                <w:color w:val="0F172A"/>
               </w:rPr>
               <w:br/>
               <w:t xml:space="preserve">            alert_id=f"ALT-BRUTE-{int(now)}",</w:t>
             </w:r>
             <w:r>
               <w:rPr>
-                <w:rFonts w:ascii="Times New Roman" w:eastAsia="Consolas" w:hAnsi="Times New Roman" w:cs="Times New Roman"/>
+                <w:rFonts w:ascii="Consolas" w:eastAsia="Consolas" w:hAnsi="Consolas" w:cs="Consolas"/>
                 <w:b/>
                 <w:i w:val="0"/>
-                <w:color w:val="FFFFFF"/>
-                <w:sz w:val="21"/>
+                <w:sz w:val="19"/>
                 <w:szCs w:val="19"/>
+                <w:color w:val="0F172A"/>
               </w:rPr>
               <w:br/>
               <w:t xml:space="preserve">            rule_name="Dò quét mật khẩu diện rộng (SSH Brute Force Attack)",</w:t>
             </w:r>
             <w:r>
               <w:rPr>
-                <w:rFonts w:ascii="Times New Roman" w:eastAsia="Consolas" w:hAnsi="Times New Roman" w:cs="Times New Roman"/>
+                <w:rFonts w:ascii="Consolas" w:eastAsia="Consolas" w:hAnsi="Consolas" w:cs="Consolas"/>
                 <w:b/>
                 <w:i w:val="0"/>
-                <w:color w:val="FFFFFF"/>
-                <w:sz w:val="21"/>
+                <w:sz w:val="19"/>
                 <w:szCs w:val="19"/>
+                <w:color w:val="0F172A"/>
               </w:rPr>
               <w:br/>
               <w:t xml:space="preserve">            mitre_technique_id="T1110.001",</w:t>
             </w:r>
             <w:r>
               <w:rPr>
-                <w:rFonts w:ascii="Times New Roman" w:eastAsia="Consolas" w:hAnsi="Times New Roman" w:cs="Times New Roman"/>
+                <w:rFonts w:ascii="Consolas" w:eastAsia="Consolas" w:hAnsi="Consolas" w:cs="Consolas"/>
                 <w:b/>
                 <w:i w:val="0"/>
-                <w:color w:val="FFFFFF"/>
-                <w:sz w:val="21"/>
+                <w:sz w:val="19"/>
                 <w:szCs w:val="19"/>
+                <w:color w:val="0F172A"/>
               </w:rPr>
               <w:br/>
               <w:t xml:space="preserve">            mitre_technique_name="Brute Force: Password Guessing",</w:t>
             </w:r>
             <w:r>
               <w:rPr>
-                <w:rFonts w:ascii="Times New Roman" w:eastAsia="Consolas" w:hAnsi="Times New Roman" w:cs="Times New Roman"/>
+                <w:rFonts w:ascii="Consolas" w:eastAsia="Consolas" w:hAnsi="Consolas" w:cs="Consolas"/>
                 <w:b/>
                 <w:i w:val="0"/>
-                <w:color w:val="FFFFFF"/>
-                <w:sz w:val="21"/>
+                <w:sz w:val="19"/>
                 <w:szCs w:val="19"/>
+                <w:color w:val="0F172A"/>
               </w:rPr>
               <w:br/>
               <w:t xml:space="preserve">            severity="HIGH",</w:t>
             </w:r>
             <w:r>
               <w:rPr>
-                <w:rFonts w:ascii="Times New Roman" w:eastAsia="Consolas" w:hAnsi="Times New Roman" w:cs="Times New Roman"/>
+                <w:rFonts w:ascii="Consolas" w:eastAsia="Consolas" w:hAnsi="Consolas" w:cs="Consolas"/>
                 <w:b/>
                 <w:i w:val="0"/>
-                <w:color w:val="FFFFFF"/>
-                <w:sz w:val="21"/>
+                <w:sz w:val="19"/>
                 <w:szCs w:val="19"/>
+                <w:color w:val="0F172A"/>
               </w:rPr>
               <w:br/>
               <w:t xml:space="preserve">            source_ip=src_ip,</w:t>
             </w:r>
             <w:r>
               <w:rPr>
-                <w:rFonts w:ascii="Times New Roman" w:eastAsia="Consolas" w:hAnsi="Times New Roman" w:cs="Times New Roman"/>
+                <w:rFonts w:ascii="Consolas" w:eastAsia="Consolas" w:hAnsi="Consolas" w:cs="Consolas"/>
                 <w:b/>
                 <w:i w:val="0"/>
-                <w:color w:val="FFFFFF"/>
-                <w:sz w:val="21"/>
+                <w:sz w:val="19"/>
                 <w:szCs w:val="19"/>
+                <w:color w:val="0F172A"/>
               </w:rPr>
               <w:br/>
               <w:t xml:space="preserve">            timestamp=timestamp,</w:t>
             </w:r>
             <w:r>
               <w:rPr>
-                <w:rFonts w:ascii="Times New Roman" w:eastAsia="Consolas" w:hAnsi="Times New Roman" w:cs="Times New Roman"/>
+                <w:rFonts w:ascii="Consolas" w:eastAsia="Consolas" w:hAnsi="Consolas" w:cs="Consolas"/>
                 <w:b/>
                 <w:i w:val="0"/>
-                <w:color w:val="FFFFFF"/>
-                <w:sz w:val="21"/>
+                <w:sz w:val="19"/>
                 <w:szCs w:val="19"/>
+                <w:color w:val="0F172A"/>
               </w:rPr>
               <w:br/>
               <w:t xml:space="preserve">            details={"failed_attempts": count, "target_user": username},</w:t>
             </w:r>
             <w:r>
               <w:rPr>
-                <w:rFonts w:ascii="Times New Roman" w:eastAsia="Consolas" w:hAnsi="Times New Roman" w:cs="Times New Roman"/>
+                <w:rFonts w:ascii="Consolas" w:eastAsia="Consolas" w:hAnsi="Consolas" w:cs="Consolas"/>
                 <w:b/>
                 <w:i w:val="0"/>
-                <w:color w:val="FFFFFF"/>
-                <w:sz w:val="21"/>
+                <w:sz w:val="19"/>
                 <w:szCs w:val="19"/>
+                <w:color w:val="0F172A"/>
               </w:rPr>
               <w:br/>
               <w:t xml:space="preserve">            recommended_action="tarpit_and_block",</w:t>
             </w:r>
             <w:r>
               <w:rPr>
-                <w:rFonts w:ascii="Times New Roman" w:eastAsia="Consolas" w:hAnsi="Times New Roman" w:cs="Times New Roman"/>
+                <w:rFonts w:ascii="Consolas" w:eastAsia="Consolas" w:hAnsi="Consolas" w:cs="Consolas"/>
                 <w:b/>
                 <w:i w:val="0"/>
-                <w:color w:val="FFFFFF"/>
-                <w:sz w:val="21"/>
+                <w:sz w:val="19"/>
                 <w:szCs w:val="19"/>
+                <w:color w:val="0F172A"/>
               </w:rPr>
               <w:br/>
               <w:t xml:space="preserve">        )</w:t>
@@ -15988,20 +16066,20 @@
         <w:jc w:val="center"/>
         <w:tblLayout w:type="fixed"/>
         <w:tblLook w:val="0400" w:firstRow="0" w:lastRow="0" w:firstColumn="0" w:lastColumn="0" w:noHBand="0" w:noVBand="1"/>
-        <w:tblBorders>
-          <w:top w:val="single" w:sz="8" w:space="0" w:color="1E293B"/>
-          <w:bottom w:val="single" w:sz="8" w:space="0" w:color="1E293B"/>
-          <w:left w:val="none"/>
-          <w:right w:val="none"/>
-          <w:insideH w:val="single" w:sz="4" w:space="0" w:color="CBD5E1"/>
-          <w:insideV w:val="single" w:sz="4" w:space="0" w:color="E2E8F0"/>
-        </w:tblBorders>
         <w:tblCellMar>
           <w:top w:w="120" w:type="dxa"/>
           <w:bottom w:w="120" w:type="dxa"/>
           <w:left w:w="160" w:type="dxa"/>
           <w:right w:w="160" w:type="dxa"/>
         </w:tblCellMar>
+        <w:tblBorders>
+          <w:top w:val="single" w:sz="4" w:space="0" w:color="CBD5E1"/>
+          <w:left w:val="single" w:sz="4" w:space="0" w:color="CBD5E1"/>
+          <w:bottom w:val="single" w:sz="4" w:space="0" w:color="CBD5E1"/>
+          <w:right w:val="single" w:sz="4" w:space="0" w:color="CBD5E1"/>
+          <w:insideH w:val="none" w:sz="0" w:space="0" w:color="auto"/>
+          <w:insideV w:val="none" w:sz="0" w:space="0" w:color="auto"/>
+        </w:tblBorders>
       </w:tblPr>
       <w:tblGrid>
         <w:gridCol w:w="9403"/>
@@ -16015,8 +16093,20 @@
         <w:tc>
           <w:tcPr>
             <w:tcW w:w="9403" w:type="dxa"/>
-            <w:shd w:fill="1E293B"/>
-            <w:vAlign w:val="center"/>
+            <w:vAlign w:val="center"/>
+            <w:shd w:fill="F8FAFC" w:val="clear"/>
+            <w:tcBorders>
+              <w:top w:val="single" w:sz="4" w:space="0" w:color="CBD5E1"/>
+              <w:left w:val="single" w:sz="4" w:space="0" w:color="CBD5E1"/>
+              <w:bottom w:val="single" w:sz="4" w:space="0" w:color="CBD5E1"/>
+              <w:right w:val="single" w:sz="4" w:space="0" w:color="CBD5E1"/>
+            </w:tcBorders>
+            <w:tcMar>
+              <w:top w:w="100" w:type="dxa"/>
+              <w:left w:w="160" w:type="dxa"/>
+              <w:bottom w:w="100" w:type="dxa"/>
+              <w:right w:w="160" w:type="dxa"/>
+            </w:tcMar>
           </w:tcPr>
           <w:p>
             <w:pPr>
@@ -16031,179 +16121,179 @@
             </w:pPr>
             <w:r>
               <w:rPr>
-                <w:rFonts w:ascii="Times New Roman" w:eastAsia="Consolas" w:hAnsi="Times New Roman" w:cs="Times New Roman"/>
+                <w:rFonts w:ascii="Consolas" w:eastAsia="Consolas" w:hAnsi="Consolas" w:cs="Consolas"/>
                 <w:b/>
                 <w:i w:val="0"/>
-                <w:color w:val="FFFFFF"/>
-                <w:sz w:val="21"/>
+                <w:sz w:val="19"/>
                 <w:szCs w:val="19"/>
+                <w:color w:val="0F172A"/>
               </w:rPr>
               <w:t>def safe_reverse_port_scan(self, ip: str, ports: Optional[List[int]] = None) -&gt; List[int]:</w:t>
             </w:r>
             <w:r>
               <w:rPr>
-                <w:rFonts w:ascii="Times New Roman" w:eastAsia="Consolas" w:hAnsi="Times New Roman" w:cs="Times New Roman"/>
+                <w:rFonts w:ascii="Consolas" w:eastAsia="Consolas" w:hAnsi="Consolas" w:cs="Consolas"/>
                 <w:b/>
                 <w:i w:val="0"/>
-                <w:color w:val="FFFFFF"/>
-                <w:sz w:val="21"/>
+                <w:sz w:val="19"/>
                 <w:szCs w:val="19"/>
+                <w:color w:val="0F172A"/>
               </w:rPr>
               <w:br/>
               <w:t xml:space="preserve">    if ports is None:</w:t>
             </w:r>
             <w:r>
               <w:rPr>
-                <w:rFonts w:ascii="Times New Roman" w:eastAsia="Consolas" w:hAnsi="Times New Roman" w:cs="Times New Roman"/>
+                <w:rFonts w:ascii="Consolas" w:eastAsia="Consolas" w:hAnsi="Consolas" w:cs="Consolas"/>
                 <w:b/>
                 <w:i w:val="0"/>
-                <w:color w:val="FFFFFF"/>
-                <w:sz w:val="21"/>
+                <w:sz w:val="19"/>
                 <w:szCs w:val="19"/>
+                <w:color w:val="0F172A"/>
               </w:rPr>
               <w:br/>
               <w:t xml:space="preserve">        ports = [21, 22, 23, 80, 443, 1080, 3128, 3389, 8080, 8888]</w:t>
             </w:r>
             <w:r>
               <w:rPr>
-                <w:rFonts w:ascii="Times New Roman" w:eastAsia="Consolas" w:hAnsi="Times New Roman" w:cs="Times New Roman"/>
+                <w:rFonts w:ascii="Consolas" w:eastAsia="Consolas" w:hAnsi="Consolas" w:cs="Consolas"/>
                 <w:b/>
                 <w:i w:val="0"/>
-                <w:color w:val="FFFFFF"/>
-                <w:sz w:val="21"/>
+                <w:sz w:val="19"/>
                 <w:szCs w:val="19"/>
+                <w:color w:val="0F172A"/>
               </w:rPr>
               <w:br/>
               <w:t xml:space="preserve">    open_ports = []</w:t>
             </w:r>
             <w:r>
               <w:rPr>
-                <w:rFonts w:ascii="Times New Roman" w:eastAsia="Consolas" w:hAnsi="Times New Roman" w:cs="Times New Roman"/>
+                <w:rFonts w:ascii="Consolas" w:eastAsia="Consolas" w:hAnsi="Consolas" w:cs="Consolas"/>
                 <w:b/>
                 <w:i w:val="0"/>
-                <w:color w:val="FFFFFF"/>
-                <w:sz w:val="21"/>
+                <w:sz w:val="19"/>
                 <w:szCs w:val="19"/>
+                <w:color w:val="0F172A"/>
               </w:rPr>
               <w:br/>
               <w:t xml:space="preserve">    for port in ports:</w:t>
             </w:r>
             <w:r>
               <w:rPr>
-                <w:rFonts w:ascii="Times New Roman" w:eastAsia="Consolas" w:hAnsi="Times New Roman" w:cs="Times New Roman"/>
+                <w:rFonts w:ascii="Consolas" w:eastAsia="Consolas" w:hAnsi="Consolas" w:cs="Consolas"/>
                 <w:b/>
                 <w:i w:val="0"/>
-                <w:color w:val="FFFFFF"/>
-                <w:sz w:val="21"/>
+                <w:sz w:val="19"/>
                 <w:szCs w:val="19"/>
+                <w:color w:val="0F172A"/>
               </w:rPr>
               <w:br/>
               <w:t xml:space="preserve">        s = socket.socket(socket.AF_INET, socket.SOCK_STREAM)</w:t>
             </w:r>
             <w:r>
               <w:rPr>
-                <w:rFonts w:ascii="Times New Roman" w:eastAsia="Consolas" w:hAnsi="Times New Roman" w:cs="Times New Roman"/>
+                <w:rFonts w:ascii="Consolas" w:eastAsia="Consolas" w:hAnsi="Consolas" w:cs="Consolas"/>
                 <w:b/>
                 <w:i w:val="0"/>
-                <w:color w:val="FFFFFF"/>
-                <w:sz w:val="21"/>
+                <w:sz w:val="19"/>
                 <w:szCs w:val="19"/>
+                <w:color w:val="0F172A"/>
               </w:rPr>
               <w:br/>
               <w:t xml:space="preserve">        s.settimeout(0.3)</w:t>
             </w:r>
             <w:r>
               <w:rPr>
-                <w:rFonts w:ascii="Times New Roman" w:eastAsia="Consolas" w:hAnsi="Times New Roman" w:cs="Times New Roman"/>
+                <w:rFonts w:ascii="Consolas" w:eastAsia="Consolas" w:hAnsi="Consolas" w:cs="Consolas"/>
                 <w:b/>
                 <w:i w:val="0"/>
-                <w:color w:val="FFFFFF"/>
-                <w:sz w:val="21"/>
+                <w:sz w:val="19"/>
                 <w:szCs w:val="19"/>
+                <w:color w:val="0F172A"/>
               </w:rPr>
               <w:br/>
               <w:t xml:space="preserve">        try:</w:t>
             </w:r>
             <w:r>
               <w:rPr>
-                <w:rFonts w:ascii="Times New Roman" w:eastAsia="Consolas" w:hAnsi="Times New Roman" w:cs="Times New Roman"/>
+                <w:rFonts w:ascii="Consolas" w:eastAsia="Consolas" w:hAnsi="Consolas" w:cs="Consolas"/>
                 <w:b/>
                 <w:i w:val="0"/>
-                <w:color w:val="FFFFFF"/>
-                <w:sz w:val="21"/>
+                <w:sz w:val="19"/>
                 <w:szCs w:val="19"/>
+                <w:color w:val="0F172A"/>
               </w:rPr>
               <w:br/>
               <w:t xml:space="preserve">            if s.connect_ex((ip, port)) == 0:</w:t>
             </w:r>
             <w:r>
               <w:rPr>
-                <w:rFonts w:ascii="Times New Roman" w:eastAsia="Consolas" w:hAnsi="Times New Roman" w:cs="Times New Roman"/>
+                <w:rFonts w:ascii="Consolas" w:eastAsia="Consolas" w:hAnsi="Consolas" w:cs="Consolas"/>
                 <w:b/>
                 <w:i w:val="0"/>
-                <w:color w:val="FFFFFF"/>
-                <w:sz w:val="21"/>
+                <w:sz w:val="19"/>
                 <w:szCs w:val="19"/>
+                <w:color w:val="0F172A"/>
               </w:rPr>
               <w:br/>
               <w:t xml:space="preserve">                open_ports.append(port)</w:t>
             </w:r>
             <w:r>
               <w:rPr>
-                <w:rFonts w:ascii="Times New Roman" w:eastAsia="Consolas" w:hAnsi="Times New Roman" w:cs="Times New Roman"/>
+                <w:rFonts w:ascii="Consolas" w:eastAsia="Consolas" w:hAnsi="Consolas" w:cs="Consolas"/>
                 <w:b/>
                 <w:i w:val="0"/>
-                <w:color w:val="FFFFFF"/>
-                <w:sz w:val="21"/>
+                <w:sz w:val="19"/>
                 <w:szCs w:val="19"/>
+                <w:color w:val="0F172A"/>
               </w:rPr>
               <w:br/>
               <w:t xml:space="preserve">        except Exception:</w:t>
             </w:r>
             <w:r>
               <w:rPr>
-                <w:rFonts w:ascii="Times New Roman" w:eastAsia="Consolas" w:hAnsi="Times New Roman" w:cs="Times New Roman"/>
+                <w:rFonts w:ascii="Consolas" w:eastAsia="Consolas" w:hAnsi="Consolas" w:cs="Consolas"/>
                 <w:b/>
                 <w:i w:val="0"/>
-                <w:color w:val="FFFFFF"/>
-                <w:sz w:val="21"/>
+                <w:sz w:val="19"/>
                 <w:szCs w:val="19"/>
+                <w:color w:val="0F172A"/>
               </w:rPr>
               <w:br/>
               <w:t xml:space="preserve">            pass</w:t>
             </w:r>
             <w:r>
               <w:rPr>
-                <w:rFonts w:ascii="Times New Roman" w:eastAsia="Consolas" w:hAnsi="Times New Roman" w:cs="Times New Roman"/>
+                <w:rFonts w:ascii="Consolas" w:eastAsia="Consolas" w:hAnsi="Consolas" w:cs="Consolas"/>
                 <w:b/>
                 <w:i w:val="0"/>
-                <w:color w:val="FFFFFF"/>
-                <w:sz w:val="21"/>
+                <w:sz w:val="19"/>
                 <w:szCs w:val="19"/>
+                <w:color w:val="0F172A"/>
               </w:rPr>
               <w:br/>
               <w:t xml:space="preserve">        finally:</w:t>
             </w:r>
             <w:r>
               <w:rPr>
-                <w:rFonts w:ascii="Times New Roman" w:eastAsia="Consolas" w:hAnsi="Times New Roman" w:cs="Times New Roman"/>
+                <w:rFonts w:ascii="Consolas" w:eastAsia="Consolas" w:hAnsi="Consolas" w:cs="Consolas"/>
                 <w:b/>
                 <w:i w:val="0"/>
-                <w:color w:val="FFFFFF"/>
-                <w:sz w:val="21"/>
+                <w:sz w:val="19"/>
                 <w:szCs w:val="19"/>
+                <w:color w:val="0F172A"/>
               </w:rPr>
               <w:br/>
               <w:t xml:space="preserve">            s.close()</w:t>
             </w:r>
             <w:r>
               <w:rPr>
-                <w:rFonts w:ascii="Times New Roman" w:eastAsia="Consolas" w:hAnsi="Times New Roman" w:cs="Times New Roman"/>
+                <w:rFonts w:ascii="Consolas" w:eastAsia="Consolas" w:hAnsi="Consolas" w:cs="Consolas"/>
                 <w:b/>
                 <w:i w:val="0"/>
-                <w:color w:val="FFFFFF"/>
-                <w:sz w:val="21"/>
+                <w:sz w:val="19"/>
                 <w:szCs w:val="19"/>
+                <w:color w:val="0F172A"/>
               </w:rPr>
               <w:br/>
               <w:t xml:space="preserve">    return open_ports</w:t>
@@ -16291,20 +16381,20 @@
         <w:jc w:val="center"/>
         <w:tblLayout w:type="fixed"/>
         <w:tblLook w:val="0400" w:firstRow="0" w:lastRow="0" w:firstColumn="0" w:lastColumn="0" w:noHBand="0" w:noVBand="1"/>
-        <w:tblBorders>
-          <w:top w:val="single" w:sz="8" w:space="0" w:color="1E293B"/>
-          <w:bottom w:val="single" w:sz="8" w:space="0" w:color="1E293B"/>
-          <w:left w:val="none"/>
-          <w:right w:val="none"/>
-          <w:insideH w:val="single" w:sz="4" w:space="0" w:color="CBD5E1"/>
-          <w:insideV w:val="single" w:sz="4" w:space="0" w:color="E2E8F0"/>
-        </w:tblBorders>
         <w:tblCellMar>
           <w:top w:w="120" w:type="dxa"/>
           <w:bottom w:w="120" w:type="dxa"/>
           <w:left w:w="160" w:type="dxa"/>
           <w:right w:w="160" w:type="dxa"/>
         </w:tblCellMar>
+        <w:tblBorders>
+          <w:top w:val="single" w:sz="4" w:space="0" w:color="CBD5E1"/>
+          <w:left w:val="single" w:sz="4" w:space="0" w:color="CBD5E1"/>
+          <w:bottom w:val="single" w:sz="4" w:space="0" w:color="CBD5E1"/>
+          <w:right w:val="single" w:sz="4" w:space="0" w:color="CBD5E1"/>
+          <w:insideH w:val="none" w:sz="0" w:space="0" w:color="auto"/>
+          <w:insideV w:val="none" w:sz="0" w:space="0" w:color="auto"/>
+        </w:tblBorders>
       </w:tblPr>
       <w:tblGrid>
         <w:gridCol w:w="9403"/>
@@ -16318,8 +16408,20 @@
         <w:tc>
           <w:tcPr>
             <w:tcW w:w="9403" w:type="dxa"/>
-            <w:shd w:fill="1E293B"/>
-            <w:vAlign w:val="center"/>
+            <w:vAlign w:val="center"/>
+            <w:shd w:fill="F8FAFC" w:val="clear"/>
+            <w:tcBorders>
+              <w:top w:val="single" w:sz="4" w:space="0" w:color="CBD5E1"/>
+              <w:left w:val="single" w:sz="4" w:space="0" w:color="CBD5E1"/>
+              <w:bottom w:val="single" w:sz="4" w:space="0" w:color="CBD5E1"/>
+              <w:right w:val="single" w:sz="4" w:space="0" w:color="CBD5E1"/>
+            </w:tcBorders>
+            <w:tcMar>
+              <w:top w:w="100" w:type="dxa"/>
+              <w:left w:w="160" w:type="dxa"/>
+              <w:bottom w:w="100" w:type="dxa"/>
+              <w:right w:w="160" w:type="dxa"/>
+            </w:tcMar>
           </w:tcPr>
           <w:p>
             <w:pPr>
@@ -16334,166 +16436,166 @@
             </w:pPr>
             <w:r>
               <w:rPr>
-                <w:rFonts w:ascii="Times New Roman" w:eastAsia="Consolas" w:hAnsi="Times New Roman" w:cs="Times New Roman"/>
+                <w:rFonts w:ascii="Consolas" w:eastAsia="Consolas" w:hAnsi="Consolas" w:cs="Consolas"/>
                 <w:b/>
                 <w:i w:val="0"/>
-                <w:color w:val="FFFFFF"/>
-                <w:sz w:val="21"/>
+                <w:sz w:val="19"/>
                 <w:szCs w:val="19"/>
+                <w:color w:val="0F172A"/>
               </w:rPr>
               <w:t>def process_beacon_callback(self, token_id: str, request_headers: Dict, real_ip: str) -&gt; Dict:</w:t>
             </w:r>
             <w:r>
               <w:rPr>
-                <w:rFonts w:ascii="Times New Roman" w:eastAsia="Consolas" w:hAnsi="Times New Roman" w:cs="Times New Roman"/>
+                <w:rFonts w:ascii="Consolas" w:eastAsia="Consolas" w:hAnsi="Consolas" w:cs="Consolas"/>
                 <w:b/>
                 <w:i w:val="0"/>
-                <w:color w:val="FFFFFF"/>
-                <w:sz w:val="21"/>
+                <w:sz w:val="19"/>
                 <w:szCs w:val="19"/>
+                <w:color w:val="0F172A"/>
               </w:rPr>
               <w:br/>
               <w:t xml:space="preserve">    token_info = self.active_tokens.get(token_id, {})</w:t>
             </w:r>
             <w:r>
               <w:rPr>
-                <w:rFonts w:ascii="Times New Roman" w:eastAsia="Consolas" w:hAnsi="Times New Roman" w:cs="Times New Roman"/>
+                <w:rFonts w:ascii="Consolas" w:eastAsia="Consolas" w:hAnsi="Consolas" w:cs="Consolas"/>
                 <w:b/>
                 <w:i w:val="0"/>
-                <w:color w:val="FFFFFF"/>
-                <w:sz w:val="21"/>
+                <w:sz w:val="19"/>
                 <w:szCs w:val="19"/>
+                <w:color w:val="0F172A"/>
               </w:rPr>
               <w:br/>
               <w:t xml:space="preserve">    token_info["status"] = "TRIGGERED"</w:t>
             </w:r>
             <w:r>
               <w:rPr>
-                <w:rFonts w:ascii="Times New Roman" w:eastAsia="Consolas" w:hAnsi="Times New Roman" w:cs="Times New Roman"/>
+                <w:rFonts w:ascii="Consolas" w:eastAsia="Consolas" w:hAnsi="Consolas" w:cs="Consolas"/>
                 <w:b/>
                 <w:i w:val="0"/>
-                <w:color w:val="FFFFFF"/>
-                <w:sz w:val="21"/>
+                <w:sz w:val="19"/>
                 <w:szCs w:val="19"/>
+                <w:color w:val="0F172A"/>
               </w:rPr>
               <w:br/>
               <w:t xml:space="preserve">    token_info["trigger_ip"] = real_ip</w:t>
             </w:r>
             <w:r>
               <w:rPr>
-                <w:rFonts w:ascii="Times New Roman" w:eastAsia="Consolas" w:hAnsi="Times New Roman" w:cs="Times New Roman"/>
+                <w:rFonts w:ascii="Consolas" w:eastAsia="Consolas" w:hAnsi="Consolas" w:cs="Consolas"/>
                 <w:b/>
                 <w:i w:val="0"/>
-                <w:color w:val="FFFFFF"/>
-                <w:sz w:val="21"/>
+                <w:sz w:val="19"/>
                 <w:szCs w:val="19"/>
+                <w:color w:val="0F172A"/>
               </w:rPr>
               <w:br/>
               <w:t xml:space="preserve">    token_info["user_agent"] = request_headers.get("User-Agent", "Unknown")</w:t>
             </w:r>
             <w:r>
               <w:rPr>
-                <w:rFonts w:ascii="Times New Roman" w:eastAsia="Consolas" w:hAnsi="Times New Roman" w:cs="Times New Roman"/>
+                <w:rFonts w:ascii="Consolas" w:eastAsia="Consolas" w:hAnsi="Consolas" w:cs="Consolas"/>
                 <w:b/>
                 <w:i w:val="0"/>
-                <w:color w:val="FFFFFF"/>
-                <w:sz w:val="21"/>
+                <w:sz w:val="19"/>
                 <w:szCs w:val="19"/>
+                <w:color w:val="0F172A"/>
               </w:rPr>
               <w:br/>
             </w:r>
             <w:r>
               <w:rPr>
-                <w:rFonts w:ascii="Times New Roman" w:eastAsia="Consolas" w:hAnsi="Times New Roman" w:cs="Times New Roman"/>
+                <w:rFonts w:ascii="Consolas" w:eastAsia="Consolas" w:hAnsi="Consolas" w:cs="Consolas"/>
                 <w:b/>
                 <w:i w:val="0"/>
-                <w:color w:val="FFFFFF"/>
-                <w:sz w:val="21"/>
+                <w:sz w:val="19"/>
                 <w:szCs w:val="19"/>
+                <w:color w:val="0F172A"/>
               </w:rPr>
               <w:br/>
               <w:t xml:space="preserve">    return {</w:t>
             </w:r>
             <w:r>
               <w:rPr>
-                <w:rFonts w:ascii="Times New Roman" w:eastAsia="Consolas" w:hAnsi="Times New Roman" w:cs="Times New Roman"/>
+                <w:rFonts w:ascii="Consolas" w:eastAsia="Consolas" w:hAnsi="Consolas" w:cs="Consolas"/>
                 <w:b/>
                 <w:i w:val="0"/>
-                <w:color w:val="FFFFFF"/>
-                <w:sz w:val="21"/>
+                <w:sz w:val="19"/>
                 <w:szCs w:val="19"/>
+                <w:color w:val="0F172A"/>
               </w:rPr>
               <w:br/>
               <w:t xml:space="preserve">        "alert": "HONEYTOKEN_TRIGGERED",</w:t>
             </w:r>
             <w:r>
               <w:rPr>
-                <w:rFonts w:ascii="Times New Roman" w:eastAsia="Consolas" w:hAnsi="Times New Roman" w:cs="Times New Roman"/>
+                <w:rFonts w:ascii="Consolas" w:eastAsia="Consolas" w:hAnsi="Consolas" w:cs="Consolas"/>
                 <w:b/>
                 <w:i w:val="0"/>
-                <w:color w:val="FFFFFF"/>
-                <w:sz w:val="21"/>
+                <w:sz w:val="19"/>
                 <w:szCs w:val="19"/>
+                <w:color w:val="0F172A"/>
               </w:rPr>
               <w:br/>
               <w:t xml:space="preserve">        "severity": "CRITICAL",</w:t>
             </w:r>
             <w:r>
               <w:rPr>
-                <w:rFonts w:ascii="Times New Roman" w:eastAsia="Consolas" w:hAnsi="Times New Roman" w:cs="Times New Roman"/>
+                <w:rFonts w:ascii="Consolas" w:eastAsia="Consolas" w:hAnsi="Consolas" w:cs="Consolas"/>
                 <w:b/>
                 <w:i w:val="0"/>
-                <w:color w:val="FFFFFF"/>
-                <w:sz w:val="21"/>
+                <w:sz w:val="19"/>
                 <w:szCs w:val="19"/>
+                <w:color w:val="0F172A"/>
               </w:rPr>
               <w:br/>
               <w:t xml:space="preserve">        "message": f"Kẻ tấn công đã mang tài liệu bẫy ({token_info.get('type')}) về máy thật để mở!",</w:t>
             </w:r>
             <w:r>
               <w:rPr>
-                <w:rFonts w:ascii="Times New Roman" w:eastAsia="Consolas" w:hAnsi="Times New Roman" w:cs="Times New Roman"/>
+                <w:rFonts w:ascii="Consolas" w:eastAsia="Consolas" w:hAnsi="Consolas" w:cs="Consolas"/>
                 <w:b/>
                 <w:i w:val="0"/>
-                <w:color w:val="FFFFFF"/>
-                <w:sz w:val="21"/>
+                <w:sz w:val="19"/>
                 <w:szCs w:val="19"/>
+                <w:color w:val="0F172A"/>
               </w:rPr>
               <w:br/>
               <w:t xml:space="preserve">        "attacker_real_ip": real_ip,</w:t>
             </w:r>
             <w:r>
               <w:rPr>
-                <w:rFonts w:ascii="Times New Roman" w:eastAsia="Consolas" w:hAnsi="Times New Roman" w:cs="Times New Roman"/>
+                <w:rFonts w:ascii="Consolas" w:eastAsia="Consolas" w:hAnsi="Consolas" w:cs="Consolas"/>
                 <w:b/>
                 <w:i w:val="0"/>
-                <w:color w:val="FFFFFF"/>
-                <w:sz w:val="21"/>
+                <w:sz w:val="19"/>
                 <w:szCs w:val="19"/>
+                <w:color w:val="0F172A"/>
               </w:rPr>
               <w:br/>
               <w:t xml:space="preserve">        "attacker_fingerprint": request_headers.get("User-Agent"),</w:t>
             </w:r>
             <w:r>
               <w:rPr>
-                <w:rFonts w:ascii="Times New Roman" w:eastAsia="Consolas" w:hAnsi="Times New Roman" w:cs="Times New Roman"/>
+                <w:rFonts w:ascii="Consolas" w:eastAsia="Consolas" w:hAnsi="Consolas" w:cs="Consolas"/>
                 <w:b/>
                 <w:i w:val="0"/>
-                <w:color w:val="FFFFFF"/>
-                <w:sz w:val="21"/>
+                <w:sz w:val="19"/>
                 <w:szCs w:val="19"/>
+                <w:color w:val="0F172A"/>
               </w:rPr>
               <w:br/>
               <w:t xml:space="preserve">        "token_details": token_info,</w:t>
             </w:r>
             <w:r>
               <w:rPr>
-                <w:rFonts w:ascii="Times New Roman" w:eastAsia="Consolas" w:hAnsi="Times New Roman" w:cs="Times New Roman"/>
+                <w:rFonts w:ascii="Consolas" w:eastAsia="Consolas" w:hAnsi="Consolas" w:cs="Consolas"/>
                 <w:b/>
                 <w:i w:val="0"/>
-                <w:color w:val="FFFFFF"/>
-                <w:sz w:val="21"/>
+                <w:sz w:val="19"/>
                 <w:szCs w:val="19"/>
+                <w:color w:val="0F172A"/>
               </w:rPr>
               <w:br/>
               <w:t xml:space="preserve">    }</w:t>
@@ -16582,20 +16684,20 @@
         <w:jc w:val="center"/>
         <w:tblLayout w:type="fixed"/>
         <w:tblLook w:val="0400" w:firstRow="0" w:lastRow="0" w:firstColumn="0" w:lastColumn="0" w:noHBand="0" w:noVBand="1"/>
-        <w:tblBorders>
-          <w:top w:val="single" w:sz="8" w:space="0" w:color="1E293B"/>
-          <w:bottom w:val="single" w:sz="8" w:space="0" w:color="1E293B"/>
-          <w:left w:val="none"/>
-          <w:right w:val="none"/>
-          <w:insideH w:val="single" w:sz="4" w:space="0" w:color="CBD5E1"/>
-          <w:insideV w:val="single" w:sz="4" w:space="0" w:color="E2E8F0"/>
-        </w:tblBorders>
         <w:tblCellMar>
           <w:top w:w="120" w:type="dxa"/>
           <w:bottom w:w="120" w:type="dxa"/>
           <w:left w:w="160" w:type="dxa"/>
           <w:right w:w="160" w:type="dxa"/>
         </w:tblCellMar>
+        <w:tblBorders>
+          <w:top w:val="single" w:sz="4" w:space="0" w:color="CBD5E1"/>
+          <w:left w:val="single" w:sz="4" w:space="0" w:color="CBD5E1"/>
+          <w:bottom w:val="single" w:sz="4" w:space="0" w:color="CBD5E1"/>
+          <w:right w:val="single" w:sz="4" w:space="0" w:color="CBD5E1"/>
+          <w:insideH w:val="none" w:sz="0" w:space="0" w:color="auto"/>
+          <w:insideV w:val="none" w:sz="0" w:space="0" w:color="auto"/>
+        </w:tblBorders>
       </w:tblPr>
       <w:tblGrid>
         <w:gridCol w:w="9403"/>
@@ -16609,8 +16711,20 @@
         <w:tc>
           <w:tcPr>
             <w:tcW w:w="9403" w:type="dxa"/>
-            <w:shd w:fill="1E293B"/>
-            <w:vAlign w:val="center"/>
+            <w:vAlign w:val="center"/>
+            <w:shd w:fill="F8FAFC" w:val="clear"/>
+            <w:tcBorders>
+              <w:top w:val="single" w:sz="4" w:space="0" w:color="CBD5E1"/>
+              <w:left w:val="single" w:sz="4" w:space="0" w:color="CBD5E1"/>
+              <w:bottom w:val="single" w:sz="4" w:space="0" w:color="CBD5E1"/>
+              <w:right w:val="single" w:sz="4" w:space="0" w:color="CBD5E1"/>
+            </w:tcBorders>
+            <w:tcMar>
+              <w:top w:w="100" w:type="dxa"/>
+              <w:left w:w="160" w:type="dxa"/>
+              <w:bottom w:w="100" w:type="dxa"/>
+              <w:right w:w="160" w:type="dxa"/>
+            </w:tcMar>
           </w:tcPr>
           <w:p>
             <w:pPr>
@@ -16625,155 +16739,155 @@
             </w:pPr>
             <w:r>
               <w:rPr>
-                <w:rFonts w:ascii="Times New Roman" w:eastAsia="Consolas" w:hAnsi="Times New Roman" w:cs="Times New Roman"/>
+                <w:rFonts w:ascii="Consolas" w:eastAsia="Consolas" w:hAnsi="Consolas" w:cs="Consolas"/>
                 <w:b/>
                 <w:i w:val="0"/>
-                <w:color w:val="FFFFFF"/>
-                <w:sz w:val="21"/>
+                <w:sz w:val="19"/>
                 <w:szCs w:val="19"/>
+                <w:color w:val="0F172A"/>
               </w:rPr>
               <w:t>def _extract_static_iocs(self, content: bytes) -&gt; Dict[str, List[str]]:</w:t>
             </w:r>
             <w:r>
               <w:rPr>
-                <w:rFonts w:ascii="Times New Roman" w:eastAsia="Consolas" w:hAnsi="Times New Roman" w:cs="Times New Roman"/>
+                <w:rFonts w:ascii="Consolas" w:eastAsia="Consolas" w:hAnsi="Consolas" w:cs="Consolas"/>
                 <w:b/>
                 <w:i w:val="0"/>
-                <w:color w:val="FFFFFF"/>
-                <w:sz w:val="21"/>
+                <w:sz w:val="19"/>
                 <w:szCs w:val="19"/>
+                <w:color w:val="0F172A"/>
               </w:rPr>
               <w:br/>
               <w:t xml:space="preserve">    text = content.decode("utf-8", errors="ignore")</w:t>
             </w:r>
             <w:r>
               <w:rPr>
-                <w:rFonts w:ascii="Times New Roman" w:eastAsia="Consolas" w:hAnsi="Times New Roman" w:cs="Times New Roman"/>
+                <w:rFonts w:ascii="Consolas" w:eastAsia="Consolas" w:hAnsi="Consolas" w:cs="Consolas"/>
                 <w:b/>
                 <w:i w:val="0"/>
-                <w:color w:val="FFFFFF"/>
-                <w:sz w:val="21"/>
+                <w:sz w:val="19"/>
                 <w:szCs w:val="19"/>
+                <w:color w:val="0F172A"/>
               </w:rPr>
               <w:br/>
               <w:t xml:space="preserve">    ip_pattern = r"\b(?:[0-9]{1,3}\.){3}[0-9]{1,3}\b"</w:t>
             </w:r>
             <w:r>
               <w:rPr>
-                <w:rFonts w:ascii="Times New Roman" w:eastAsia="Consolas" w:hAnsi="Times New Roman" w:cs="Times New Roman"/>
+                <w:rFonts w:ascii="Consolas" w:eastAsia="Consolas" w:hAnsi="Consolas" w:cs="Consolas"/>
                 <w:b/>
                 <w:i w:val="0"/>
-                <w:color w:val="FFFFFF"/>
-                <w:sz w:val="21"/>
+                <w:sz w:val="19"/>
                 <w:szCs w:val="19"/>
+                <w:color w:val="0F172A"/>
               </w:rPr>
               <w:br/>
               <w:t xml:space="preserve">    url_pattern = r"https?://(?:[-\w.]|(?:%[\da-fA-F]{2}))+[^\s]*"</w:t>
             </w:r>
             <w:r>
               <w:rPr>
-                <w:rFonts w:ascii="Times New Roman" w:eastAsia="Consolas" w:hAnsi="Times New Roman" w:cs="Times New Roman"/>
+                <w:rFonts w:ascii="Consolas" w:eastAsia="Consolas" w:hAnsi="Consolas" w:cs="Consolas"/>
                 <w:b/>
                 <w:i w:val="0"/>
-                <w:color w:val="FFFFFF"/>
-                <w:sz w:val="21"/>
+                <w:sz w:val="19"/>
                 <w:szCs w:val="19"/>
+                <w:color w:val="0F172A"/>
               </w:rPr>
               <w:br/>
               <w:t xml:space="preserve">    </w:t>
             </w:r>
             <w:r>
               <w:rPr>
-                <w:rFonts w:ascii="Times New Roman" w:eastAsia="Consolas" w:hAnsi="Times New Roman" w:cs="Times New Roman"/>
+                <w:rFonts w:ascii="Consolas" w:eastAsia="Consolas" w:hAnsi="Consolas" w:cs="Consolas"/>
                 <w:b/>
                 <w:i w:val="0"/>
-                <w:color w:val="FFFFFF"/>
-                <w:sz w:val="21"/>
+                <w:sz w:val="19"/>
                 <w:szCs w:val="19"/>
+                <w:color w:val="0F172A"/>
               </w:rPr>
               <w:br/>
               <w:t xml:space="preserve">    ips = list(set(re.findall(ip_pattern, text)))</w:t>
             </w:r>
             <w:r>
               <w:rPr>
-                <w:rFonts w:ascii="Times New Roman" w:eastAsia="Consolas" w:hAnsi="Times New Roman" w:cs="Times New Roman"/>
+                <w:rFonts w:ascii="Consolas" w:eastAsia="Consolas" w:hAnsi="Consolas" w:cs="Consolas"/>
                 <w:b/>
                 <w:i w:val="0"/>
-                <w:color w:val="FFFFFF"/>
-                <w:sz w:val="21"/>
+                <w:sz w:val="19"/>
                 <w:szCs w:val="19"/>
+                <w:color w:val="0F172A"/>
               </w:rPr>
               <w:br/>
               <w:t xml:space="preserve">    urls = list(set(re.findall(url_pattern, text)))</w:t>
             </w:r>
             <w:r>
               <w:rPr>
-                <w:rFonts w:ascii="Times New Roman" w:eastAsia="Consolas" w:hAnsi="Times New Roman" w:cs="Times New Roman"/>
+                <w:rFonts w:ascii="Consolas" w:eastAsia="Consolas" w:hAnsi="Consolas" w:cs="Consolas"/>
                 <w:b/>
                 <w:i w:val="0"/>
-                <w:color w:val="FFFFFF"/>
-                <w:sz w:val="21"/>
+                <w:sz w:val="19"/>
                 <w:szCs w:val="19"/>
+                <w:color w:val="0F172A"/>
               </w:rPr>
               <w:br/>
               <w:t xml:space="preserve">    signatures = []</w:t>
             </w:r>
             <w:r>
               <w:rPr>
-                <w:rFonts w:ascii="Times New Roman" w:eastAsia="Consolas" w:hAnsi="Times New Roman" w:cs="Times New Roman"/>
+                <w:rFonts w:ascii="Consolas" w:eastAsia="Consolas" w:hAnsi="Consolas" w:cs="Consolas"/>
                 <w:b/>
                 <w:i w:val="0"/>
-                <w:color w:val="FFFFFF"/>
-                <w:sz w:val="21"/>
+                <w:sz w:val="19"/>
                 <w:szCs w:val="19"/>
+                <w:color w:val="0F172A"/>
               </w:rPr>
               <w:br/>
               <w:t xml:space="preserve">    if "xmrig" in text.lower():</w:t>
             </w:r>
             <w:r>
               <w:rPr>
-                <w:rFonts w:ascii="Times New Roman" w:eastAsia="Consolas" w:hAnsi="Times New Roman" w:cs="Times New Roman"/>
+                <w:rFonts w:ascii="Consolas" w:eastAsia="Consolas" w:hAnsi="Consolas" w:cs="Consolas"/>
                 <w:b/>
                 <w:i w:val="0"/>
-                <w:color w:val="FFFFFF"/>
-                <w:sz w:val="21"/>
+                <w:sz w:val="19"/>
                 <w:szCs w:val="19"/>
+                <w:color w:val="0F172A"/>
               </w:rPr>
               <w:br/>
               <w:t xml:space="preserve">        signatures.append("Cryptocurrency Miner (XMRig / Monero)")</w:t>
             </w:r>
             <w:r>
               <w:rPr>
-                <w:rFonts w:ascii="Times New Roman" w:eastAsia="Consolas" w:hAnsi="Times New Roman" w:cs="Times New Roman"/>
+                <w:rFonts w:ascii="Consolas" w:eastAsia="Consolas" w:hAnsi="Consolas" w:cs="Consolas"/>
                 <w:b/>
                 <w:i w:val="0"/>
-                <w:color w:val="FFFFFF"/>
-                <w:sz w:val="21"/>
+                <w:sz w:val="19"/>
                 <w:szCs w:val="19"/>
+                <w:color w:val="0F172A"/>
               </w:rPr>
               <w:br/>
               <w:t xml:space="preserve">    if "/bin/busybox" in text or "dvrHelper" in text or "mirai" in text.lower():</w:t>
             </w:r>
             <w:r>
               <w:rPr>
-                <w:rFonts w:ascii="Times New Roman" w:eastAsia="Consolas" w:hAnsi="Times New Roman" w:cs="Times New Roman"/>
+                <w:rFonts w:ascii="Consolas" w:eastAsia="Consolas" w:hAnsi="Consolas" w:cs="Consolas"/>
                 <w:b/>
                 <w:i w:val="0"/>
-                <w:color w:val="FFFFFF"/>
-                <w:sz w:val="21"/>
+                <w:sz w:val="19"/>
                 <w:szCs w:val="19"/>
+                <w:color w:val="0F172A"/>
               </w:rPr>
               <w:br/>
               <w:t xml:space="preserve">        signatures.append("IoT Botnet Variant (Mirai / Gafgyt)")</w:t>
             </w:r>
             <w:r>
               <w:rPr>
-                <w:rFonts w:ascii="Times New Roman" w:eastAsia="Consolas" w:hAnsi="Times New Roman" w:cs="Times New Roman"/>
+                <w:rFonts w:ascii="Consolas" w:eastAsia="Consolas" w:hAnsi="Consolas" w:cs="Consolas"/>
                 <w:b/>
                 <w:i w:val="0"/>
-                <w:color w:val="FFFFFF"/>
-                <w:sz w:val="21"/>
+                <w:sz w:val="19"/>
                 <w:szCs w:val="19"/>
+                <w:color w:val="0F172A"/>
               </w:rPr>
               <w:br/>
               <w:t xml:space="preserve">    return {"ips": ips, "urls": urls, "signatures": signatures}</w:t>
@@ -16861,20 +16975,20 @@
         <w:jc w:val="center"/>
         <w:tblLayout w:type="fixed"/>
         <w:tblLook w:val="0400" w:firstRow="0" w:lastRow="0" w:firstColumn="0" w:lastColumn="0" w:noHBand="0" w:noVBand="1"/>
-        <w:tblBorders>
-          <w:top w:val="single" w:sz="8" w:space="0" w:color="1E293B"/>
-          <w:bottom w:val="single" w:sz="8" w:space="0" w:color="1E293B"/>
-          <w:left w:val="none"/>
-          <w:right w:val="none"/>
-          <w:insideH w:val="single" w:sz="4" w:space="0" w:color="CBD5E1"/>
-          <w:insideV w:val="single" w:sz="4" w:space="0" w:color="E2E8F0"/>
-        </w:tblBorders>
         <w:tblCellMar>
           <w:top w:w="120" w:type="dxa"/>
           <w:bottom w:w="120" w:type="dxa"/>
           <w:left w:w="160" w:type="dxa"/>
           <w:right w:w="160" w:type="dxa"/>
         </w:tblCellMar>
+        <w:tblBorders>
+          <w:top w:val="single" w:sz="4" w:space="0" w:color="CBD5E1"/>
+          <w:left w:val="single" w:sz="4" w:space="0" w:color="CBD5E1"/>
+          <w:bottom w:val="single" w:sz="4" w:space="0" w:color="CBD5E1"/>
+          <w:right w:val="single" w:sz="4" w:space="0" w:color="CBD5E1"/>
+          <w:insideH w:val="none" w:sz="0" w:space="0" w:color="auto"/>
+          <w:insideV w:val="none" w:sz="0" w:space="0" w:color="auto"/>
+        </w:tblBorders>
       </w:tblPr>
       <w:tblGrid>
         <w:gridCol w:w="9403"/>
@@ -16888,8 +17002,20 @@
         <w:tc>
           <w:tcPr>
             <w:tcW w:w="9403" w:type="dxa"/>
-            <w:shd w:fill="1E293B"/>
-            <w:vAlign w:val="center"/>
+            <w:vAlign w:val="center"/>
+            <w:shd w:fill="F8FAFC" w:val="clear"/>
+            <w:tcBorders>
+              <w:top w:val="single" w:sz="4" w:space="0" w:color="CBD5E1"/>
+              <w:left w:val="single" w:sz="4" w:space="0" w:color="CBD5E1"/>
+              <w:bottom w:val="single" w:sz="4" w:space="0" w:color="CBD5E1"/>
+              <w:right w:val="single" w:sz="4" w:space="0" w:color="CBD5E1"/>
+            </w:tcBorders>
+            <w:tcMar>
+              <w:top w:w="100" w:type="dxa"/>
+              <w:left w:w="160" w:type="dxa"/>
+              <w:bottom w:w="100" w:type="dxa"/>
+              <w:right w:w="160" w:type="dxa"/>
+            </w:tcMar>
           </w:tcPr>
           <w:p>
             <w:pPr>
@@ -16904,166 +17030,166 @@
             </w:pPr>
             <w:r>
               <w:rPr>
-                <w:rFonts w:ascii="Times New Roman" w:eastAsia="Consolas" w:hAnsi="Times New Roman" w:cs="Times New Roman"/>
+                <w:rFonts w:ascii="Consolas" w:eastAsia="Consolas" w:hAnsi="Consolas" w:cs="Consolas"/>
                 <w:b/>
                 <w:i w:val="0"/>
-                <w:color w:val="FFFFFF"/>
-                <w:sz w:val="21"/>
+                <w:sz w:val="19"/>
                 <w:szCs w:val="19"/>
+                <w:color w:val="0F172A"/>
               </w:rPr>
               <w:t>def block_ip(self, ip: str, duration_sec: int = 3600, reason: str = "Brute Force") -&gt; Dict:</w:t>
             </w:r>
             <w:r>
               <w:rPr>
-                <w:rFonts w:ascii="Times New Roman" w:eastAsia="Consolas" w:hAnsi="Times New Roman" w:cs="Times New Roman"/>
+                <w:rFonts w:ascii="Consolas" w:eastAsia="Consolas" w:hAnsi="Consolas" w:cs="Consolas"/>
                 <w:b/>
                 <w:i w:val="0"/>
-                <w:color w:val="FFFFFF"/>
-                <w:sz w:val="21"/>
+                <w:sz w:val="19"/>
                 <w:szCs w:val="19"/>
+                <w:color w:val="0F172A"/>
               </w:rPr>
               <w:br/>
               <w:t xml:space="preserve">    if ip in self.whitelist:</w:t>
             </w:r>
             <w:r>
               <w:rPr>
-                <w:rFonts w:ascii="Times New Roman" w:eastAsia="Consolas" w:hAnsi="Times New Roman" w:cs="Times New Roman"/>
+                <w:rFonts w:ascii="Consolas" w:eastAsia="Consolas" w:hAnsi="Consolas" w:cs="Consolas"/>
                 <w:b/>
                 <w:i w:val="0"/>
-                <w:color w:val="FFFFFF"/>
-                <w:sz w:val="21"/>
+                <w:sz w:val="19"/>
                 <w:szCs w:val="19"/>
+                <w:color w:val="0F172A"/>
               </w:rPr>
               <w:br/>
               <w:t xml:space="preserve">        return {"status": "skipped", "message": "IP nằm trong Whitelist an toàn"}</w:t>
             </w:r>
             <w:r>
               <w:rPr>
-                <w:rFonts w:ascii="Times New Roman" w:eastAsia="Consolas" w:hAnsi="Times New Roman" w:cs="Times New Roman"/>
+                <w:rFonts w:ascii="Consolas" w:eastAsia="Consolas" w:hAnsi="Consolas" w:cs="Consolas"/>
                 <w:b/>
                 <w:i w:val="0"/>
-                <w:color w:val="FFFFFF"/>
-                <w:sz w:val="21"/>
+                <w:sz w:val="19"/>
                 <w:szCs w:val="19"/>
+                <w:color w:val="0F172A"/>
               </w:rPr>
               <w:br/>
               <w:t xml:space="preserve">    if "linux" in self.os_type:</w:t>
             </w:r>
             <w:r>
               <w:rPr>
-                <w:rFonts w:ascii="Times New Roman" w:eastAsia="Consolas" w:hAnsi="Times New Roman" w:cs="Times New Roman"/>
+                <w:rFonts w:ascii="Consolas" w:eastAsia="Consolas" w:hAnsi="Consolas" w:cs="Consolas"/>
                 <w:b/>
                 <w:i w:val="0"/>
-                <w:color w:val="FFFFFF"/>
-                <w:sz w:val="21"/>
+                <w:sz w:val="19"/>
                 <w:szCs w:val="19"/>
+                <w:color w:val="0F172A"/>
               </w:rPr>
               <w:br/>
               <w:t xml:space="preserve">        subprocess.run(["iptables", "-I", "INPUT", "-s", ip, "-j", "DROP"], check=True)</w:t>
             </w:r>
             <w:r>
               <w:rPr>
-                <w:rFonts w:ascii="Times New Roman" w:eastAsia="Consolas" w:hAnsi="Times New Roman" w:cs="Times New Roman"/>
+                <w:rFonts w:ascii="Consolas" w:eastAsia="Consolas" w:hAnsi="Consolas" w:cs="Consolas"/>
                 <w:b/>
                 <w:i w:val="0"/>
-                <w:color w:val="FFFFFF"/>
-                <w:sz w:val="21"/>
+                <w:sz w:val="19"/>
                 <w:szCs w:val="19"/>
+                <w:color w:val="0F172A"/>
               </w:rPr>
               <w:br/>
               <w:t xml:space="preserve">    self.blocked_ips[ip] = time.time() + duration_sec</w:t>
             </w:r>
             <w:r>
               <w:rPr>
-                <w:rFonts w:ascii="Times New Roman" w:eastAsia="Consolas" w:hAnsi="Times New Roman" w:cs="Times New Roman"/>
+                <w:rFonts w:ascii="Consolas" w:eastAsia="Consolas" w:hAnsi="Consolas" w:cs="Consolas"/>
                 <w:b/>
                 <w:i w:val="0"/>
-                <w:color w:val="FFFFFF"/>
-                <w:sz w:val="21"/>
+                <w:sz w:val="19"/>
                 <w:szCs w:val="19"/>
+                <w:color w:val="0F172A"/>
               </w:rPr>
               <w:br/>
               <w:t xml:space="preserve">    self._append_to_ioc_feed(ip, reason)</w:t>
             </w:r>
             <w:r>
               <w:rPr>
-                <w:rFonts w:ascii="Times New Roman" w:eastAsia="Consolas" w:hAnsi="Times New Roman" w:cs="Times New Roman"/>
+                <w:rFonts w:ascii="Consolas" w:eastAsia="Consolas" w:hAnsi="Consolas" w:cs="Consolas"/>
                 <w:b/>
                 <w:i w:val="0"/>
-                <w:color w:val="FFFFFF"/>
-                <w:sz w:val="21"/>
+                <w:sz w:val="19"/>
                 <w:szCs w:val="19"/>
+                <w:color w:val="0F172A"/>
               </w:rPr>
               <w:br/>
               <w:t xml:space="preserve">    return {"status": "success", "action": "FIREWALL_BLOCK", "ip": ip}</w:t>
             </w:r>
             <w:r>
               <w:rPr>
-                <w:rFonts w:ascii="Times New Roman" w:eastAsia="Consolas" w:hAnsi="Times New Roman" w:cs="Times New Roman"/>
+                <w:rFonts w:ascii="Consolas" w:eastAsia="Consolas" w:hAnsi="Consolas" w:cs="Consolas"/>
                 <w:b/>
                 <w:i w:val="0"/>
-                <w:color w:val="FFFFFF"/>
-                <w:sz w:val="21"/>
+                <w:sz w:val="19"/>
                 <w:szCs w:val="19"/>
+                <w:color w:val="0F172A"/>
               </w:rPr>
               <w:br/>
             </w:r>
             <w:r>
               <w:rPr>
-                <w:rFonts w:ascii="Times New Roman" w:eastAsia="Consolas" w:hAnsi="Times New Roman" w:cs="Times New Roman"/>
+                <w:rFonts w:ascii="Consolas" w:eastAsia="Consolas" w:hAnsi="Consolas" w:cs="Consolas"/>
                 <w:b/>
                 <w:i w:val="0"/>
-                <w:color w:val="FFFFFF"/>
-                <w:sz w:val="21"/>
+                <w:sz w:val="19"/>
                 <w:szCs w:val="19"/>
+                <w:color w:val="0F172A"/>
               </w:rPr>
               <w:br/>
               <w:t>def tarpit_ip(self, ip: str) -&gt; Dict:</w:t>
             </w:r>
             <w:r>
               <w:rPr>
-                <w:rFonts w:ascii="Times New Roman" w:eastAsia="Consolas" w:hAnsi="Times New Roman" w:cs="Times New Roman"/>
+                <w:rFonts w:ascii="Consolas" w:eastAsia="Consolas" w:hAnsi="Consolas" w:cs="Consolas"/>
                 <w:b/>
                 <w:i w:val="0"/>
-                <w:color w:val="FFFFFF"/>
-                <w:sz w:val="21"/>
+                <w:sz w:val="19"/>
                 <w:szCs w:val="19"/>
+                <w:color w:val="0F172A"/>
               </w:rPr>
               <w:br/>
               <w:t xml:space="preserve">    if "linux" in self.os_type:</w:t>
             </w:r>
             <w:r>
               <w:rPr>
-                <w:rFonts w:ascii="Times New Roman" w:eastAsia="Consolas" w:hAnsi="Times New Roman" w:cs="Times New Roman"/>
+                <w:rFonts w:ascii="Consolas" w:eastAsia="Consolas" w:hAnsi="Consolas" w:cs="Consolas"/>
                 <w:b/>
                 <w:i w:val="0"/>
-                <w:color w:val="FFFFFF"/>
-                <w:sz w:val="21"/>
+                <w:sz w:val="19"/>
                 <w:szCs w:val="19"/>
+                <w:color w:val="0F172A"/>
               </w:rPr>
               <w:br/>
               <w:t xml:space="preserve">        cmd = f"iptables -t nat -A PREROUTING -p tcp -s {ip} --dport 2222 -j REDIRECT --to-ports 22222"</w:t>
             </w:r>
             <w:r>
               <w:rPr>
-                <w:rFonts w:ascii="Times New Roman" w:eastAsia="Consolas" w:hAnsi="Times New Roman" w:cs="Times New Roman"/>
+                <w:rFonts w:ascii="Consolas" w:eastAsia="Consolas" w:hAnsi="Consolas" w:cs="Consolas"/>
                 <w:b/>
                 <w:i w:val="0"/>
-                <w:color w:val="FFFFFF"/>
-                <w:sz w:val="21"/>
+                <w:sz w:val="19"/>
                 <w:szCs w:val="19"/>
+                <w:color w:val="0F172A"/>
               </w:rPr>
               <w:br/>
               <w:t xml:space="preserve">        subprocess.run(cmd.split(), capture_output=True)</w:t>
             </w:r>
             <w:r>
               <w:rPr>
-                <w:rFonts w:ascii="Times New Roman" w:eastAsia="Consolas" w:hAnsi="Times New Roman" w:cs="Times New Roman"/>
+                <w:rFonts w:ascii="Consolas" w:eastAsia="Consolas" w:hAnsi="Consolas" w:cs="Consolas"/>
                 <w:b/>
                 <w:i w:val="0"/>
-                <w:color w:val="FFFFFF"/>
-                <w:sz w:val="21"/>
+                <w:sz w:val="19"/>
                 <w:szCs w:val="19"/>
+                <w:color w:val="0F172A"/>
               </w:rPr>
               <w:br/>
               <w:t xml:space="preserve">    return {"status": "success", "action": "TARPIT_RESOURCE_EXHAUSTION", "ip": ip}</w:t>
@@ -17152,20 +17278,20 @@
         <w:jc w:val="center"/>
         <w:tblLayout w:type="fixed"/>
         <w:tblLook w:val="0400" w:firstRow="0" w:lastRow="0" w:firstColumn="0" w:lastColumn="0" w:noHBand="0" w:noVBand="1"/>
-        <w:tblBorders>
-          <w:top w:val="single" w:sz="8" w:space="0" w:color="1E293B"/>
-          <w:bottom w:val="single" w:sz="8" w:space="0" w:color="1E293B"/>
-          <w:left w:val="none"/>
-          <w:right w:val="none"/>
-          <w:insideH w:val="single" w:sz="4" w:space="0" w:color="CBD5E1"/>
-          <w:insideV w:val="single" w:sz="4" w:space="0" w:color="E2E8F0"/>
-        </w:tblBorders>
         <w:tblCellMar>
           <w:top w:w="120" w:type="dxa"/>
           <w:bottom w:w="120" w:type="dxa"/>
           <w:left w:w="160" w:type="dxa"/>
           <w:right w:w="160" w:type="dxa"/>
         </w:tblCellMar>
+        <w:tblBorders>
+          <w:top w:val="single" w:sz="4" w:space="0" w:color="CBD5E1"/>
+          <w:left w:val="single" w:sz="4" w:space="0" w:color="CBD5E1"/>
+          <w:bottom w:val="single" w:sz="4" w:space="0" w:color="CBD5E1"/>
+          <w:right w:val="single" w:sz="4" w:space="0" w:color="CBD5E1"/>
+          <w:insideH w:val="none" w:sz="0" w:space="0" w:color="auto"/>
+          <w:insideV w:val="none" w:sz="0" w:space="0" w:color="auto"/>
+        </w:tblBorders>
       </w:tblPr>
       <w:tblGrid>
         <w:gridCol w:w="9403"/>
@@ -17179,8 +17305,20 @@
         <w:tc>
           <w:tcPr>
             <w:tcW w:w="9403" w:type="dxa"/>
-            <w:shd w:fill="1E293B"/>
-            <w:vAlign w:val="center"/>
+            <w:vAlign w:val="center"/>
+            <w:shd w:fill="F8FAFC" w:val="clear"/>
+            <w:tcBorders>
+              <w:top w:val="single" w:sz="4" w:space="0" w:color="CBD5E1"/>
+              <w:left w:val="single" w:sz="4" w:space="0" w:color="CBD5E1"/>
+              <w:bottom w:val="single" w:sz="4" w:space="0" w:color="CBD5E1"/>
+              <w:right w:val="single" w:sz="4" w:space="0" w:color="CBD5E1"/>
+            </w:tcBorders>
+            <w:tcMar>
+              <w:top w:w="100" w:type="dxa"/>
+              <w:left w:w="160" w:type="dxa"/>
+              <w:bottom w:w="100" w:type="dxa"/>
+              <w:right w:w="160" w:type="dxa"/>
+            </w:tcMar>
           </w:tcPr>
           <w:p>
             <w:pPr>
@@ -17195,155 +17333,155 @@
             </w:pPr>
             <w:r>
               <w:rPr>
-                <w:rFonts w:ascii="Times New Roman" w:eastAsia="Consolas" w:hAnsi="Times New Roman" w:cs="Times New Roman"/>
+                <w:rFonts w:ascii="Consolas" w:eastAsia="Consolas" w:hAnsi="Consolas" w:cs="Consolas"/>
                 <w:b/>
                 <w:i w:val="0"/>
-                <w:color w:val="FFFFFF"/>
-                <w:sz w:val="21"/>
+                <w:sz w:val="19"/>
                 <w:szCs w:val="19"/>
+                <w:color w:val="0F172A"/>
               </w:rPr>
               <w:t>reply_markup = {</w:t>
             </w:r>
             <w:r>
               <w:rPr>
-                <w:rFonts w:ascii="Times New Roman" w:eastAsia="Consolas" w:hAnsi="Times New Roman" w:cs="Times New Roman"/>
+                <w:rFonts w:ascii="Consolas" w:eastAsia="Consolas" w:hAnsi="Consolas" w:cs="Consolas"/>
                 <w:b/>
                 <w:i w:val="0"/>
-                <w:color w:val="FFFFFF"/>
-                <w:sz w:val="21"/>
+                <w:sz w:val="19"/>
                 <w:szCs w:val="19"/>
+                <w:color w:val="0F172A"/>
               </w:rPr>
               <w:br/>
               <w:t xml:space="preserve">    "inline_keyboard": [</w:t>
             </w:r>
             <w:r>
               <w:rPr>
-                <w:rFonts w:ascii="Times New Roman" w:eastAsia="Consolas" w:hAnsi="Times New Roman" w:cs="Times New Roman"/>
+                <w:rFonts w:ascii="Consolas" w:eastAsia="Consolas" w:hAnsi="Consolas" w:cs="Consolas"/>
                 <w:b/>
                 <w:i w:val="0"/>
-                <w:color w:val="FFFFFF"/>
-                <w:sz w:val="21"/>
+                <w:sz w:val="19"/>
                 <w:szCs w:val="19"/>
+                <w:color w:val="0F172A"/>
               </w:rPr>
               <w:br/>
               <w:t xml:space="preserve">        [</w:t>
             </w:r>
             <w:r>
               <w:rPr>
-                <w:rFonts w:ascii="Times New Roman" w:eastAsia="Consolas" w:hAnsi="Times New Roman" w:cs="Times New Roman"/>
+                <w:rFonts w:ascii="Consolas" w:eastAsia="Consolas" w:hAnsi="Consolas" w:cs="Consolas"/>
                 <w:b/>
                 <w:i w:val="0"/>
-                <w:color w:val="FFFFFF"/>
-                <w:sz w:val="21"/>
+                <w:sz w:val="19"/>
                 <w:szCs w:val="19"/>
+                <w:color w:val="0F172A"/>
               </w:rPr>
               <w:br/>
               <w:t xml:space="preserve">            {"text": "Trinh sát ngược OSINT", "callback_data": f"recon:{ip}"},</w:t>
             </w:r>
             <w:r>
               <w:rPr>
-                <w:rFonts w:ascii="Times New Roman" w:eastAsia="Consolas" w:hAnsi="Times New Roman" w:cs="Times New Roman"/>
+                <w:rFonts w:ascii="Consolas" w:eastAsia="Consolas" w:hAnsi="Consolas" w:cs="Consolas"/>
                 <w:b/>
                 <w:i w:val="0"/>
-                <w:color w:val="FFFFFF"/>
-                <w:sz w:val="21"/>
+                <w:sz w:val="19"/>
                 <w:szCs w:val="19"/>
+                <w:color w:val="0F172A"/>
               </w:rPr>
               <w:br/>
               <w:t xml:space="preserve">            {"text": "Đưa vào Tarpit", "callback_data": f"tarpit:{ip}"},</w:t>
             </w:r>
             <w:r>
               <w:rPr>
-                <w:rFonts w:ascii="Times New Roman" w:eastAsia="Consolas" w:hAnsi="Times New Roman" w:cs="Times New Roman"/>
+                <w:rFonts w:ascii="Consolas" w:eastAsia="Consolas" w:hAnsi="Consolas" w:cs="Consolas"/>
                 <w:b/>
                 <w:i w:val="0"/>
-                <w:color w:val="FFFFFF"/>
-                <w:sz w:val="21"/>
+                <w:sz w:val="19"/>
                 <w:szCs w:val="19"/>
+                <w:color w:val="0F172A"/>
               </w:rPr>
               <w:br/>
               <w:t xml:space="preserve">        ],</w:t>
             </w:r>
             <w:r>
               <w:rPr>
-                <w:rFonts w:ascii="Times New Roman" w:eastAsia="Consolas" w:hAnsi="Times New Roman" w:cs="Times New Roman"/>
+                <w:rFonts w:ascii="Consolas" w:eastAsia="Consolas" w:hAnsi="Consolas" w:cs="Consolas"/>
                 <w:b/>
                 <w:i w:val="0"/>
-                <w:color w:val="FFFFFF"/>
-                <w:sz w:val="21"/>
+                <w:sz w:val="19"/>
                 <w:szCs w:val="19"/>
+                <w:color w:val="0F172A"/>
               </w:rPr>
               <w:br/>
               <w:t xml:space="preserve">        [</w:t>
             </w:r>
             <w:r>
               <w:rPr>
-                <w:rFonts w:ascii="Times New Roman" w:eastAsia="Consolas" w:hAnsi="Times New Roman" w:cs="Times New Roman"/>
+                <w:rFonts w:ascii="Consolas" w:eastAsia="Consolas" w:hAnsi="Consolas" w:cs="Consolas"/>
                 <w:b/>
                 <w:i w:val="0"/>
-                <w:color w:val="FFFFFF"/>
-                <w:sz w:val="21"/>
+                <w:sz w:val="19"/>
                 <w:szCs w:val="19"/>
+                <w:color w:val="0F172A"/>
               </w:rPr>
               <w:br/>
               <w:t xml:space="preserve">            {"text": "Chặn Firewall tức thì", "callback_data": f"block:{ip}"},</w:t>
             </w:r>
             <w:r>
               <w:rPr>
-                <w:rFonts w:ascii="Times New Roman" w:eastAsia="Consolas" w:hAnsi="Times New Roman" w:cs="Times New Roman"/>
+                <w:rFonts w:ascii="Consolas" w:eastAsia="Consolas" w:hAnsi="Consolas" w:cs="Consolas"/>
                 <w:b/>
                 <w:i w:val="0"/>
-                <w:color w:val="FFFFFF"/>
-                <w:sz w:val="21"/>
+                <w:sz w:val="19"/>
                 <w:szCs w:val="19"/>
+                <w:color w:val="0F172A"/>
               </w:rPr>
               <w:br/>
               <w:t xml:space="preserve">            {"text": "Mở khóa IP", "callback_data": f"unblock:{ip}"},</w:t>
             </w:r>
             <w:r>
               <w:rPr>
-                <w:rFonts w:ascii="Times New Roman" w:eastAsia="Consolas" w:hAnsi="Times New Roman" w:cs="Times New Roman"/>
+                <w:rFonts w:ascii="Consolas" w:eastAsia="Consolas" w:hAnsi="Consolas" w:cs="Consolas"/>
                 <w:b/>
                 <w:i w:val="0"/>
-                <w:color w:val="FFFFFF"/>
-                <w:sz w:val="21"/>
+                <w:sz w:val="19"/>
                 <w:szCs w:val="19"/>
+                <w:color w:val="0F172A"/>
               </w:rPr>
               <w:br/>
               <w:t xml:space="preserve">        ],</w:t>
             </w:r>
             <w:r>
               <w:rPr>
-                <w:rFonts w:ascii="Times New Roman" w:eastAsia="Consolas" w:hAnsi="Times New Roman" w:cs="Times New Roman"/>
+                <w:rFonts w:ascii="Consolas" w:eastAsia="Consolas" w:hAnsi="Consolas" w:cs="Consolas"/>
                 <w:b/>
                 <w:i w:val="0"/>
-                <w:color w:val="FFFFFF"/>
-                <w:sz w:val="21"/>
+                <w:sz w:val="19"/>
                 <w:szCs w:val="19"/>
+                <w:color w:val="0F172A"/>
               </w:rPr>
               <w:br/>
               <w:t xml:space="preserve">    ]</w:t>
             </w:r>
             <w:r>
               <w:rPr>
-                <w:rFonts w:ascii="Times New Roman" w:eastAsia="Consolas" w:hAnsi="Times New Roman" w:cs="Times New Roman"/>
+                <w:rFonts w:ascii="Consolas" w:eastAsia="Consolas" w:hAnsi="Consolas" w:cs="Consolas"/>
                 <w:b/>
                 <w:i w:val="0"/>
-                <w:color w:val="FFFFFF"/>
-                <w:sz w:val="21"/>
+                <w:sz w:val="19"/>
                 <w:szCs w:val="19"/>
+                <w:color w:val="0F172A"/>
               </w:rPr>
               <w:br/>
               <w:t>}</w:t>
             </w:r>
             <w:r>
               <w:rPr>
-                <w:rFonts w:ascii="Times New Roman" w:eastAsia="Consolas" w:hAnsi="Times New Roman" w:cs="Times New Roman"/>
+                <w:rFonts w:ascii="Consolas" w:eastAsia="Consolas" w:hAnsi="Consolas" w:cs="Consolas"/>
                 <w:b/>
                 <w:i w:val="0"/>
-                <w:color w:val="FFFFFF"/>
-                <w:sz w:val="21"/>
+                <w:sz w:val="19"/>
                 <w:szCs w:val="19"/>
+                <w:color w:val="0F172A"/>
               </w:rPr>
               <w:br/>
               <w:t>payload = {"chat_id": self.chat_id, "text": text, "parse_mode": "HTML", "reply_markup": json.dumps(reply_markup)}</w:t>
@@ -22365,20 +22503,20 @@
         <w:jc w:val="center"/>
         <w:tblLayout w:type="fixed"/>
         <w:tblLook w:val="0400" w:firstRow="0" w:lastRow="0" w:firstColumn="0" w:lastColumn="0" w:noHBand="0" w:noVBand="1"/>
-        <w:tblBorders>
-          <w:top w:val="single" w:sz="8" w:space="0" w:color="1E293B"/>
-          <w:bottom w:val="single" w:sz="8" w:space="0" w:color="1E293B"/>
-          <w:left w:val="none"/>
-          <w:right w:val="none"/>
-          <w:insideH w:val="single" w:sz="4" w:space="0" w:color="CBD5E1"/>
-          <w:insideV w:val="single" w:sz="4" w:space="0" w:color="E2E8F0"/>
-        </w:tblBorders>
         <w:tblCellMar>
           <w:top w:w="120" w:type="dxa"/>
           <w:bottom w:w="120" w:type="dxa"/>
           <w:left w:w="160" w:type="dxa"/>
           <w:right w:w="160" w:type="dxa"/>
         </w:tblCellMar>
+        <w:tblBorders>
+          <w:top w:val="none" w:sz="0" w:space="0" w:color="auto"/>
+          <w:left w:val="single" w:sz="24" w:space="0" w:color="003366"/>
+          <w:bottom w:val="none" w:sz="0" w:space="0" w:color="auto"/>
+          <w:right w:val="none" w:sz="0" w:space="0" w:color="auto"/>
+          <w:insideH w:val="none" w:sz="0" w:space="0" w:color="auto"/>
+          <w:insideV w:val="none" w:sz="0" w:space="0" w:color="auto"/>
+        </w:tblBorders>
       </w:tblPr>
       <w:tblGrid>
         <w:gridCol w:w="9403"/>
@@ -22392,8 +22530,20 @@
         <w:tc>
           <w:tcPr>
             <w:tcW w:w="9403" w:type="dxa"/>
-            <w:shd w:fill="1E293B"/>
-            <w:vAlign w:val="center"/>
+            <w:vAlign w:val="center"/>
+            <w:shd w:fill="F8FAFC" w:val="clear"/>
+            <w:tcBorders>
+              <w:top w:val="none" w:sz="0" w:space="0" w:color="auto"/>
+              <w:left w:val="single" w:sz="24" w:space="0" w:color="003366"/>
+              <w:bottom w:val="none" w:sz="0" w:space="0" w:color="auto"/>
+              <w:right w:val="none" w:sz="0" w:space="0" w:color="auto"/>
+            </w:tcBorders>
+            <w:tcMar>
+              <w:top w:w="120" w:type="dxa"/>
+              <w:left w:w="180" w:type="dxa"/>
+              <w:bottom w:w="120" w:type="dxa"/>
+              <w:right w:w="180" w:type="dxa"/>
+            </w:tcMar>
           </w:tcPr>
           <w:p>
             <w:pPr>
@@ -22412,8 +22562,9 @@
                 <w:b/>
                 <w:bCs/>
                 <w:i w:val="0"/>
-                <w:color w:val="FFFFFF"/>
-                <w:sz w:val="21"/>
+                <w:sz w:val="22"/>
+                <w:szCs w:val="22"/>
+                <w:color w:val="0F172A"/>
               </w:rPr>
               <w:t>📌 ĐÁNH GIÁ SỰ CHUYỂN DỊCH GIÁ TRỊ KỸ THUẬT CỦA ĐỒ ÁN:</w:t>
             </w:r>
@@ -22423,8 +22574,9 @@
                 <w:b/>
                 <w:bCs/>
                 <w:i w:val="0"/>
-                <w:color w:val="FFFFFF"/>
-                <w:sz w:val="21"/>
+                <w:sz w:val="22"/>
+                <w:szCs w:val="22"/>
+                <w:color w:val="0F172A"/>
               </w:rPr>
               <w:br/>
             </w:r>
@@ -22434,8 +22586,9 @@
                 <w:b/>
                 <w:i w:val="0"/>
                 <w:iCs/>
-                <w:color w:val="FFFFFF"/>
-                <w:sz w:val="21"/>
+                <w:sz w:val="22"/>
+                <w:szCs w:val="22"/>
+                <w:color w:val="0F172A"/>
               </w:rPr>
               <w:t>Lời khẳng định học thuật: Đề tài đã chuyển hóa triệt để từ một 'bài tập cài đặt phần mềm và gửi tin nhắn thông thường' (Application Configuration Level) thành một 'Công trình Nghiên cứu &amp; Kỹ thuật Kỹ sư Hệ thống Toàn diện' (Comprehensive Security Engineering Project). Sinh viên không chỉ áp dụng công cụ bề nổi mà đã tự tay thiết kế và lập trình hơn 1.200 dòng mã nguồn Python chuyên sâu, giải quyết các bài toán hóc búa về Tương quan dữ liệu, Trinh sát ngược, Khử ẩn danh đối thủ và Tự động hóa tác chiến.</w:t>
             </w:r>
@@ -23323,20 +23476,20 @@
         <w:jc w:val="center"/>
         <w:tblLayout w:type="fixed"/>
         <w:tblLook w:val="0400" w:firstRow="0" w:lastRow="0" w:firstColumn="0" w:lastColumn="0" w:noHBand="0" w:noVBand="1"/>
-        <w:tblBorders>
-          <w:top w:val="single" w:sz="8" w:space="0" w:color="1E293B"/>
-          <w:bottom w:val="single" w:sz="8" w:space="0" w:color="1E293B"/>
-          <w:left w:val="none"/>
-          <w:right w:val="none"/>
-          <w:insideH w:val="single" w:sz="4" w:space="0" w:color="CBD5E1"/>
-          <w:insideV w:val="single" w:sz="4" w:space="0" w:color="E2E8F0"/>
-        </w:tblBorders>
         <w:tblCellMar>
           <w:top w:w="120" w:type="dxa"/>
           <w:bottom w:w="120" w:type="dxa"/>
           <w:left w:w="160" w:type="dxa"/>
           <w:right w:w="160" w:type="dxa"/>
         </w:tblCellMar>
+        <w:tblBorders>
+          <w:top w:val="single" w:sz="4" w:space="0" w:color="CBD5E1"/>
+          <w:left w:val="single" w:sz="4" w:space="0" w:color="CBD5E1"/>
+          <w:bottom w:val="single" w:sz="4" w:space="0" w:color="CBD5E1"/>
+          <w:right w:val="single" w:sz="4" w:space="0" w:color="CBD5E1"/>
+          <w:insideH w:val="none" w:sz="0" w:space="0" w:color="auto"/>
+          <w:insideV w:val="none" w:sz="0" w:space="0" w:color="auto"/>
+        </w:tblBorders>
       </w:tblPr>
       <w:tblGrid>
         <w:gridCol w:w="9403"/>
@@ -23350,8 +23503,20 @@
         <w:tc>
           <w:tcPr>
             <w:tcW w:w="9403" w:type="dxa"/>
-            <w:shd w:fill="1E293B"/>
-            <w:vAlign w:val="center"/>
+            <w:vAlign w:val="center"/>
+            <w:shd w:fill="F8FAFC" w:val="clear"/>
+            <w:tcBorders>
+              <w:top w:val="single" w:sz="4" w:space="0" w:color="CBD5E1"/>
+              <w:left w:val="single" w:sz="4" w:space="0" w:color="CBD5E1"/>
+              <w:bottom w:val="single" w:sz="4" w:space="0" w:color="CBD5E1"/>
+              <w:right w:val="single" w:sz="4" w:space="0" w:color="CBD5E1"/>
+            </w:tcBorders>
+            <w:tcMar>
+              <w:top w:w="100" w:type="dxa"/>
+              <w:left w:w="160" w:type="dxa"/>
+              <w:bottom w:w="100" w:type="dxa"/>
+              <w:right w:w="160" w:type="dxa"/>
+            </w:tcMar>
           </w:tcPr>
           <w:p>
             <w:pPr>
@@ -23366,83 +23531,83 @@
             </w:pPr>
             <w:r>
               <w:rPr>
-                <w:rFonts w:ascii="Times New Roman" w:eastAsia="Consolas" w:hAnsi="Times New Roman" w:cs="Times New Roman"/>
+                <w:rFonts w:ascii="Consolas" w:eastAsia="Consolas" w:hAnsi="Consolas" w:cs="Consolas"/>
                 <w:b/>
                 <w:i w:val="0"/>
-                <w:color w:val="FFFFFF"/>
-                <w:sz w:val="21"/>
+                <w:sz w:val="19"/>
                 <w:szCs w:val="19"/>
+                <w:color w:val="0F172A"/>
               </w:rPr>
               <w:t>sudo apt-get update &amp;&amp; sudo apt-get install -y git python3-pip python3-virtualenv iptables</w:t>
             </w:r>
             <w:r>
               <w:rPr>
-                <w:rFonts w:ascii="Times New Roman" w:eastAsia="Consolas" w:hAnsi="Times New Roman" w:cs="Times New Roman"/>
+                <w:rFonts w:ascii="Consolas" w:eastAsia="Consolas" w:hAnsi="Consolas" w:cs="Consolas"/>
                 <w:b/>
                 <w:i w:val="0"/>
-                <w:color w:val="FFFFFF"/>
-                <w:sz w:val="21"/>
+                <w:sz w:val="19"/>
                 <w:szCs w:val="19"/>
+                <w:color w:val="0F172A"/>
               </w:rPr>
               <w:br/>
               <w:t>git clone https://github.com/cowrie/cowrie.git</w:t>
             </w:r>
             <w:r>
               <w:rPr>
-                <w:rFonts w:ascii="Times New Roman" w:eastAsia="Consolas" w:hAnsi="Times New Roman" w:cs="Times New Roman"/>
+                <w:rFonts w:ascii="Consolas" w:eastAsia="Consolas" w:hAnsi="Consolas" w:cs="Consolas"/>
                 <w:b/>
                 <w:i w:val="0"/>
-                <w:color w:val="FFFFFF"/>
-                <w:sz w:val="21"/>
+                <w:sz w:val="19"/>
                 <w:szCs w:val="19"/>
+                <w:color w:val="0F172A"/>
               </w:rPr>
               <w:br/>
               <w:t>cd cowrie</w:t>
             </w:r>
             <w:r>
               <w:rPr>
-                <w:rFonts w:ascii="Times New Roman" w:eastAsia="Consolas" w:hAnsi="Times New Roman" w:cs="Times New Roman"/>
+                <w:rFonts w:ascii="Consolas" w:eastAsia="Consolas" w:hAnsi="Consolas" w:cs="Consolas"/>
                 <w:b/>
                 <w:i w:val="0"/>
-                <w:color w:val="FFFFFF"/>
-                <w:sz w:val="21"/>
+                <w:sz w:val="19"/>
                 <w:szCs w:val="19"/>
+                <w:color w:val="0F172A"/>
               </w:rPr>
               <w:br/>
               <w:t>virtualenv --python=python3 cowrie-env</w:t>
             </w:r>
             <w:r>
               <w:rPr>
-                <w:rFonts w:ascii="Times New Roman" w:eastAsia="Consolas" w:hAnsi="Times New Roman" w:cs="Times New Roman"/>
+                <w:rFonts w:ascii="Consolas" w:eastAsia="Consolas" w:hAnsi="Consolas" w:cs="Consolas"/>
                 <w:b/>
                 <w:i w:val="0"/>
-                <w:color w:val="FFFFFF"/>
-                <w:sz w:val="21"/>
+                <w:sz w:val="19"/>
                 <w:szCs w:val="19"/>
+                <w:color w:val="0F172A"/>
               </w:rPr>
               <w:br/>
               <w:t>source cowrie-env/bin/activate</w:t>
             </w:r>
             <w:r>
               <w:rPr>
-                <w:rFonts w:ascii="Times New Roman" w:eastAsia="Consolas" w:hAnsi="Times New Roman" w:cs="Times New Roman"/>
+                <w:rFonts w:ascii="Consolas" w:eastAsia="Consolas" w:hAnsi="Consolas" w:cs="Consolas"/>
                 <w:b/>
                 <w:i w:val="0"/>
-                <w:color w:val="FFFFFF"/>
-                <w:sz w:val="21"/>
+                <w:sz w:val="19"/>
                 <w:szCs w:val="19"/>
+                <w:color w:val="0F172A"/>
               </w:rPr>
               <w:br/>
               <w:t>pip install --upgrade pip &amp;&amp; pip install -r requirements.txt</w:t>
             </w:r>
             <w:r>
               <w:rPr>
-                <w:rFonts w:ascii="Times New Roman" w:eastAsia="Consolas" w:hAnsi="Times New Roman" w:cs="Times New Roman"/>
+                <w:rFonts w:ascii="Consolas" w:eastAsia="Consolas" w:hAnsi="Consolas" w:cs="Consolas"/>
                 <w:b/>
                 <w:i w:val="0"/>
-                <w:color w:val="FFFFFF"/>
-                <w:sz w:val="21"/>
+                <w:sz w:val="19"/>
                 <w:szCs w:val="19"/>
+                <w:color w:val="0F172A"/>
               </w:rPr>
               <w:br/>
               <w:t>bin/cowrie start</w:t>
@@ -23505,20 +23670,20 @@
         <w:jc w:val="center"/>
         <w:tblLayout w:type="fixed"/>
         <w:tblLook w:val="0400" w:firstRow="0" w:lastRow="0" w:firstColumn="0" w:lastColumn="0" w:noHBand="0" w:noVBand="1"/>
-        <w:tblBorders>
-          <w:top w:val="single" w:sz="8" w:space="0" w:color="1E293B"/>
-          <w:bottom w:val="single" w:sz="8" w:space="0" w:color="1E293B"/>
-          <w:left w:val="none"/>
-          <w:right w:val="none"/>
-          <w:insideH w:val="single" w:sz="4" w:space="0" w:color="CBD5E1"/>
-          <w:insideV w:val="single" w:sz="4" w:space="0" w:color="E2E8F0"/>
-        </w:tblBorders>
         <w:tblCellMar>
           <w:top w:w="120" w:type="dxa"/>
           <w:bottom w:w="120" w:type="dxa"/>
           <w:left w:w="160" w:type="dxa"/>
           <w:right w:w="160" w:type="dxa"/>
         </w:tblCellMar>
+        <w:tblBorders>
+          <w:top w:val="single" w:sz="4" w:space="0" w:color="CBD5E1"/>
+          <w:left w:val="single" w:sz="4" w:space="0" w:color="CBD5E1"/>
+          <w:bottom w:val="single" w:sz="4" w:space="0" w:color="CBD5E1"/>
+          <w:right w:val="single" w:sz="4" w:space="0" w:color="CBD5E1"/>
+          <w:insideH w:val="none" w:sz="0" w:space="0" w:color="auto"/>
+          <w:insideV w:val="none" w:sz="0" w:space="0" w:color="auto"/>
+        </w:tblBorders>
       </w:tblPr>
       <w:tblGrid>
         <w:gridCol w:w="9403"/>
@@ -23532,8 +23697,20 @@
         <w:tc>
           <w:tcPr>
             <w:tcW w:w="9403" w:type="dxa"/>
-            <w:shd w:fill="1E293B"/>
-            <w:vAlign w:val="center"/>
+            <w:vAlign w:val="center"/>
+            <w:shd w:fill="F8FAFC" w:val="clear"/>
+            <w:tcBorders>
+              <w:top w:val="single" w:sz="4" w:space="0" w:color="CBD5E1"/>
+              <w:left w:val="single" w:sz="4" w:space="0" w:color="CBD5E1"/>
+              <w:bottom w:val="single" w:sz="4" w:space="0" w:color="CBD5E1"/>
+              <w:right w:val="single" w:sz="4" w:space="0" w:color="CBD5E1"/>
+            </w:tcBorders>
+            <w:tcMar>
+              <w:top w:w="100" w:type="dxa"/>
+              <w:left w:w="160" w:type="dxa"/>
+              <w:bottom w:w="100" w:type="dxa"/>
+              <w:right w:w="160" w:type="dxa"/>
+            </w:tcMar>
           </w:tcPr>
           <w:p>
             <w:pPr>
@@ -23548,23 +23725,23 @@
             </w:pPr>
             <w:r>
               <w:rPr>
-                <w:rFonts w:ascii="Times New Roman" w:eastAsia="Consolas" w:hAnsi="Times New Roman" w:cs="Times New Roman"/>
+                <w:rFonts w:ascii="Consolas" w:eastAsia="Consolas" w:hAnsi="Consolas" w:cs="Consolas"/>
                 <w:b/>
                 <w:i w:val="0"/>
-                <w:color w:val="FFFFFF"/>
-                <w:sz w:val="21"/>
+                <w:sz w:val="19"/>
                 <w:szCs w:val="19"/>
+                <w:color w:val="0F172A"/>
               </w:rPr>
               <w:t>sudo iptables -t nat -A PREROUTING -p tcp --dport 22 -j REDIRECT --to-port 2222</w:t>
             </w:r>
             <w:r>
               <w:rPr>
-                <w:rFonts w:ascii="Times New Roman" w:eastAsia="Consolas" w:hAnsi="Times New Roman" w:cs="Times New Roman"/>
+                <w:rFonts w:ascii="Consolas" w:eastAsia="Consolas" w:hAnsi="Consolas" w:cs="Consolas"/>
                 <w:b/>
                 <w:i w:val="0"/>
-                <w:color w:val="FFFFFF"/>
-                <w:sz w:val="21"/>
+                <w:sz w:val="19"/>
                 <w:szCs w:val="19"/>
+                <w:color w:val="0F172A"/>
               </w:rPr>
               <w:br/>
               <w:t>sudo iptables-save &gt; /etc/iptables/</w:t>
@@ -23572,24 +23749,24 @@
             <w:proofErr w:type="gramStart"/>
             <w:r>
               <w:rPr>
-                <w:rFonts w:ascii="Times New Roman" w:eastAsia="Consolas" w:hAnsi="Times New Roman" w:cs="Times New Roman"/>
+                <w:rFonts w:ascii="Consolas" w:eastAsia="Consolas" w:hAnsi="Consolas" w:cs="Consolas"/>
                 <w:b/>
                 <w:i w:val="0"/>
-                <w:color w:val="FFFFFF"/>
-                <w:sz w:val="21"/>
+                <w:sz w:val="19"/>
                 <w:szCs w:val="19"/>
+                <w:color w:val="0F172A"/>
               </w:rPr>
               <w:t>rules.v</w:t>
             </w:r>
             <w:proofErr w:type="gramEnd"/>
             <w:r>
               <w:rPr>
-                <w:rFonts w:ascii="Times New Roman" w:eastAsia="Consolas" w:hAnsi="Times New Roman" w:cs="Times New Roman"/>
+                <w:rFonts w:ascii="Consolas" w:eastAsia="Consolas" w:hAnsi="Consolas" w:cs="Consolas"/>
                 <w:b/>
                 <w:i w:val="0"/>
-                <w:color w:val="FFFFFF"/>
-                <w:sz w:val="21"/>
+                <w:sz w:val="19"/>
                 <w:szCs w:val="19"/>
+                <w:color w:val="0F172A"/>
               </w:rPr>
               <w:t>4</w:t>
             </w:r>
@@ -23651,20 +23828,20 @@
         <w:jc w:val="center"/>
         <w:tblLayout w:type="fixed"/>
         <w:tblLook w:val="0400" w:firstRow="0" w:lastRow="0" w:firstColumn="0" w:lastColumn="0" w:noHBand="0" w:noVBand="1"/>
-        <w:tblBorders>
-          <w:top w:val="single" w:sz="8" w:space="0" w:color="1E293B"/>
-          <w:bottom w:val="single" w:sz="8" w:space="0" w:color="1E293B"/>
-          <w:left w:val="none"/>
-          <w:right w:val="none"/>
-          <w:insideH w:val="single" w:sz="4" w:space="0" w:color="CBD5E1"/>
-          <w:insideV w:val="single" w:sz="4" w:space="0" w:color="E2E8F0"/>
-        </w:tblBorders>
         <w:tblCellMar>
           <w:top w:w="120" w:type="dxa"/>
           <w:bottom w:w="120" w:type="dxa"/>
           <w:left w:w="160" w:type="dxa"/>
           <w:right w:w="160" w:type="dxa"/>
         </w:tblCellMar>
+        <w:tblBorders>
+          <w:top w:val="single" w:sz="4" w:space="0" w:color="CBD5E1"/>
+          <w:left w:val="single" w:sz="4" w:space="0" w:color="CBD5E1"/>
+          <w:bottom w:val="single" w:sz="4" w:space="0" w:color="CBD5E1"/>
+          <w:right w:val="single" w:sz="4" w:space="0" w:color="CBD5E1"/>
+          <w:insideH w:val="none" w:sz="0" w:space="0" w:color="auto"/>
+          <w:insideV w:val="none" w:sz="0" w:space="0" w:color="auto"/>
+        </w:tblBorders>
       </w:tblPr>
       <w:tblGrid>
         <w:gridCol w:w="9403"/>
@@ -23678,8 +23855,20 @@
         <w:tc>
           <w:tcPr>
             <w:tcW w:w="9403" w:type="dxa"/>
-            <w:shd w:fill="1E293B"/>
-            <w:vAlign w:val="center"/>
+            <w:vAlign w:val="center"/>
+            <w:shd w:fill="F8FAFC" w:val="clear"/>
+            <w:tcBorders>
+              <w:top w:val="single" w:sz="4" w:space="0" w:color="CBD5E1"/>
+              <w:left w:val="single" w:sz="4" w:space="0" w:color="CBD5E1"/>
+              <w:bottom w:val="single" w:sz="4" w:space="0" w:color="CBD5E1"/>
+              <w:right w:val="single" w:sz="4" w:space="0" w:color="CBD5E1"/>
+            </w:tcBorders>
+            <w:tcMar>
+              <w:top w:w="100" w:type="dxa"/>
+              <w:left w:w="160" w:type="dxa"/>
+              <w:bottom w:w="100" w:type="dxa"/>
+              <w:right w:w="160" w:type="dxa"/>
+            </w:tcMar>
           </w:tcPr>
           <w:p>
             <w:pPr>
@@ -23694,35 +23883,35 @@
             </w:pPr>
             <w:r>
               <w:rPr>
-                <w:rFonts w:ascii="Times New Roman" w:eastAsia="Consolas" w:hAnsi="Times New Roman" w:cs="Times New Roman"/>
+                <w:rFonts w:ascii="Consolas" w:eastAsia="Consolas" w:hAnsi="Consolas" w:cs="Consolas"/>
                 <w:b/>
                 <w:i w:val="0"/>
-                <w:color w:val="FFFFFF"/>
-                <w:sz w:val="21"/>
+                <w:sz w:val="19"/>
                 <w:szCs w:val="19"/>
+                <w:color w:val="0F172A"/>
               </w:rPr>
               <w:t>cd /path/to/soc-honeynet-active-defense</w:t>
             </w:r>
             <w:r>
               <w:rPr>
-                <w:rFonts w:ascii="Times New Roman" w:eastAsia="Consolas" w:hAnsi="Times New Roman" w:cs="Times New Roman"/>
+                <w:rFonts w:ascii="Consolas" w:eastAsia="Consolas" w:hAnsi="Consolas" w:cs="Consolas"/>
                 <w:b/>
                 <w:i w:val="0"/>
-                <w:color w:val="FFFFFF"/>
-                <w:sz w:val="21"/>
+                <w:sz w:val="19"/>
                 <w:szCs w:val="19"/>
+                <w:color w:val="0F172A"/>
               </w:rPr>
               <w:br/>
               <w:t>python3 -m pip install -r requirements.txt</w:t>
             </w:r>
             <w:r>
               <w:rPr>
-                <w:rFonts w:ascii="Times New Roman" w:eastAsia="Consolas" w:hAnsi="Times New Roman" w:cs="Times New Roman"/>
+                <w:rFonts w:ascii="Consolas" w:eastAsia="Consolas" w:hAnsi="Consolas" w:cs="Consolas"/>
                 <w:b/>
                 <w:i w:val="0"/>
-                <w:color w:val="FFFFFF"/>
-                <w:sz w:val="21"/>
+                <w:sz w:val="19"/>
                 <w:szCs w:val="19"/>
+                <w:color w:val="0F172A"/>
               </w:rPr>
               <w:br/>
               <w:t>python3 main.py</w:t>
@@ -23810,20 +23999,20 @@
         <w:jc w:val="center"/>
         <w:tblLayout w:type="fixed"/>
         <w:tblLook w:val="0400" w:firstRow="0" w:lastRow="0" w:firstColumn="0" w:lastColumn="0" w:noHBand="0" w:noVBand="1"/>
-        <w:tblBorders>
-          <w:top w:val="single" w:sz="8" w:space="0" w:color="1E293B"/>
-          <w:bottom w:val="single" w:sz="8" w:space="0" w:color="1E293B"/>
-          <w:left w:val="none"/>
-          <w:right w:val="none"/>
-          <w:insideH w:val="single" w:sz="4" w:space="0" w:color="CBD5E1"/>
-          <w:insideV w:val="single" w:sz="4" w:space="0" w:color="E2E8F0"/>
-        </w:tblBorders>
         <w:tblCellMar>
           <w:top w:w="120" w:type="dxa"/>
           <w:bottom w:w="120" w:type="dxa"/>
           <w:left w:w="160" w:type="dxa"/>
           <w:right w:w="160" w:type="dxa"/>
         </w:tblCellMar>
+        <w:tblBorders>
+          <w:top w:val="single" w:sz="4" w:space="0" w:color="CBD5E1"/>
+          <w:left w:val="single" w:sz="4" w:space="0" w:color="CBD5E1"/>
+          <w:bottom w:val="single" w:sz="4" w:space="0" w:color="CBD5E1"/>
+          <w:right w:val="single" w:sz="4" w:space="0" w:color="CBD5E1"/>
+          <w:insideH w:val="none" w:sz="0" w:space="0" w:color="auto"/>
+          <w:insideV w:val="none" w:sz="0" w:space="0" w:color="auto"/>
+        </w:tblBorders>
       </w:tblPr>
       <w:tblGrid>
         <w:gridCol w:w="9403"/>
@@ -23837,8 +24026,20 @@
         <w:tc>
           <w:tcPr>
             <w:tcW w:w="9403" w:type="dxa"/>
-            <w:shd w:fill="1E293B"/>
-            <w:vAlign w:val="center"/>
+            <w:vAlign w:val="center"/>
+            <w:shd w:fill="F8FAFC" w:val="clear"/>
+            <w:tcBorders>
+              <w:top w:val="single" w:sz="4" w:space="0" w:color="CBD5E1"/>
+              <w:left w:val="single" w:sz="4" w:space="0" w:color="CBD5E1"/>
+              <w:bottom w:val="single" w:sz="4" w:space="0" w:color="CBD5E1"/>
+              <w:right w:val="single" w:sz="4" w:space="0" w:color="CBD5E1"/>
+            </w:tcBorders>
+            <w:tcMar>
+              <w:top w:w="100" w:type="dxa"/>
+              <w:left w:w="160" w:type="dxa"/>
+              <w:bottom w:w="100" w:type="dxa"/>
+              <w:right w:w="160" w:type="dxa"/>
+            </w:tcMar>
           </w:tcPr>
           <w:p>
             <w:pPr>
@@ -23853,23 +24054,23 @@
             </w:pPr>
             <w:r>
               <w:rPr>
-                <w:rFonts w:ascii="Times New Roman" w:eastAsia="Consolas" w:hAnsi="Times New Roman" w:cs="Times New Roman"/>
+                <w:rFonts w:ascii="Consolas" w:eastAsia="Consolas" w:hAnsi="Consolas" w:cs="Consolas"/>
                 <w:b/>
                 <w:i w:val="0"/>
-                <w:color w:val="FFFFFF"/>
-                <w:sz w:val="21"/>
+                <w:sz w:val="19"/>
                 <w:szCs w:val="19"/>
+                <w:color w:val="0F172A"/>
               </w:rPr>
               <w:t>python3 scripts/simulate_attack.py</w:t>
             </w:r>
             <w:r>
               <w:rPr>
-                <w:rFonts w:ascii="Times New Roman" w:eastAsia="Consolas" w:hAnsi="Times New Roman" w:cs="Times New Roman"/>
+                <w:rFonts w:ascii="Consolas" w:eastAsia="Consolas" w:hAnsi="Consolas" w:cs="Consolas"/>
                 <w:b/>
                 <w:i w:val="0"/>
-                <w:color w:val="FFFFFF"/>
-                <w:sz w:val="21"/>
+                <w:sz w:val="19"/>
                 <w:szCs w:val="19"/>
+                <w:color w:val="0F172A"/>
               </w:rPr>
               <w:br/>
               <w:t>python3 scripts/test_pipeline.py</w:t>

</xml_diff>